<commit_message>
docs(hive-serv): record delta ruling + AXIS-only communication rule (v0.2 addendum)
Owner rulings (2026-10-13):
- Delta question closed: the AXIS fabric generator (fabric-gen-ip/delta)
  IS the fabric; the archived NoC draft and the generator describe the
  same fabric. Re-home was organizational. (HAS ch2, MAS ch1, PRD)
- Communication protocol rule: everything crossing a block boundary is
  AXI4-Stream; AXI4-Lite only for register windows; no AXI4 full in HIVE.
  Internal control network is AXIS-shaped (32-bit, tvalid/tready/tlast,
  tuser[0] urgent) so the repo stream DV stack covers it. (HAS ch4,
  MAS ch1/§2.4/§3)

Rebuild HIVE_{HAS,MAS}_v0.2 PDFs.

Co-authored-by: Claude Opus 4.8 (1M context) <noreply@anthropic.com>
</commit_message>
<xml_diff>
--- a/projects/components/riscv-ip/hive-serv/docs/HIVE_MAS_v0.2.docx
+++ b/projects/components/riscv-ip/hive-serv/docs/HIVE_MAS_v0.2.docx
@@ -160,7 +160,7 @@
             </w:rPr>
             <w:fldChar w:fldCharType="separate"/>
           </w:r>
-          <w:hyperlink w:anchor="__RefHeading___Toc8531_131033504">
+          <w:hyperlink w:anchor="__RefHeading___Toc8615_1988885074">
             <w:r>
               <w:rPr>
                 <w:webHidden/>
@@ -181,7 +181,7 @@
             </w:tabs>
             <w:rPr/>
           </w:pPr>
-          <w:hyperlink w:anchor="__RefHeading___Toc8533_131033504">
+          <w:hyperlink w:anchor="__RefHeading___Toc8617_1988885074">
             <w:r>
               <w:rPr>
                 <w:webHidden/>
@@ -202,7 +202,7 @@
             </w:tabs>
             <w:rPr/>
           </w:pPr>
-          <w:hyperlink w:anchor="__RefHeading___Toc8535_131033504">
+          <w:hyperlink w:anchor="__RefHeading___Toc8619_1988885074">
             <w:r>
               <w:rPr>
                 <w:webHidden/>
@@ -223,7 +223,7 @@
             </w:tabs>
             <w:rPr/>
           </w:pPr>
-          <w:hyperlink w:anchor="__RefHeading___Toc8537_131033504">
+          <w:hyperlink w:anchor="__RefHeading___Toc8621_1988885074">
             <w:r>
               <w:rPr>
                 <w:webHidden/>
@@ -244,7 +244,7 @@
             </w:tabs>
             <w:rPr/>
           </w:pPr>
-          <w:hyperlink w:anchor="__RefHeading___Toc8539_131033504">
+          <w:hyperlink w:anchor="__RefHeading___Toc8623_1988885074">
             <w:r>
               <w:rPr>
                 <w:webHidden/>
@@ -265,7 +265,7 @@
             </w:tabs>
             <w:rPr/>
           </w:pPr>
-          <w:hyperlink w:anchor="__RefHeading___Toc8541_131033504">
+          <w:hyperlink w:anchor="__RefHeading___Toc8625_1988885074">
             <w:r>
               <w:rPr>
                 <w:webHidden/>
@@ -286,7 +286,7 @@
             </w:tabs>
             <w:rPr/>
           </w:pPr>
-          <w:hyperlink w:anchor="__RefHeading___Toc8543_131033504">
+          <w:hyperlink w:anchor="__RefHeading___Toc8627_1988885074">
             <w:r>
               <w:rPr>
                 <w:webHidden/>
@@ -307,7 +307,7 @@
             </w:tabs>
             <w:rPr/>
           </w:pPr>
-          <w:hyperlink w:anchor="__RefHeading___Toc8545_131033504">
+          <w:hyperlink w:anchor="__RefHeading___Toc8629_1988885074">
             <w:r>
               <w:rPr>
                 <w:webHidden/>
@@ -328,7 +328,7 @@
             </w:tabs>
             <w:rPr/>
           </w:pPr>
-          <w:hyperlink w:anchor="__RefHeading___Toc8547_131033504">
+          <w:hyperlink w:anchor="__RefHeading___Toc8631_1988885074">
             <w:r>
               <w:rPr>
                 <w:webHidden/>
@@ -349,7 +349,7 @@
             </w:tabs>
             <w:rPr/>
           </w:pPr>
-          <w:hyperlink w:anchor="__RefHeading___Toc8549_131033504">
+          <w:hyperlink w:anchor="__RefHeading___Toc8633_1988885074">
             <w:r>
               <w:rPr>
                 <w:webHidden/>
@@ -370,7 +370,7 @@
             </w:tabs>
             <w:rPr/>
           </w:pPr>
-          <w:hyperlink w:anchor="__RefHeading___Toc8551_131033504">
+          <w:hyperlink w:anchor="__RefHeading___Toc8635_1988885074">
             <w:r>
               <w:rPr>
                 <w:webHidden/>
@@ -378,7 +378,7 @@
               </w:rPr>
               <w:t>3.3 What Is Imported vs. What Is Built</w:t>
               <w:tab/>
-              <w:t>15</w:t>
+              <w:t>16</w:t>
             </w:r>
           </w:hyperlink>
         </w:p>
@@ -391,7 +391,7 @@
             </w:tabs>
             <w:rPr/>
           </w:pPr>
-          <w:hyperlink w:anchor="__RefHeading___Toc8553_131033504">
+          <w:hyperlink w:anchor="__RefHeading___Toc8637_1988885074">
             <w:r>
               <w:rPr>
                 <w:webHidden/>
@@ -412,7 +412,7 @@
             </w:tabs>
             <w:rPr/>
           </w:pPr>
-          <w:hyperlink w:anchor="__RefHeading___Toc8555_131033504">
+          <w:hyperlink w:anchor="__RefHeading___Toc8639_1988885074">
             <w:r>
               <w:rPr>
                 <w:webHidden/>
@@ -433,7 +433,7 @@
             </w:tabs>
             <w:rPr/>
           </w:pPr>
-          <w:hyperlink w:anchor="__RefHeading___Toc8557_131033504">
+          <w:hyperlink w:anchor="__RefHeading___Toc8641_1988885074">
             <w:r>
               <w:rPr>
                 <w:webHidden/>
@@ -454,7 +454,7 @@
             </w:tabs>
             <w:rPr/>
           </w:pPr>
-          <w:hyperlink w:anchor="__RefHeading___Toc8559_131033504">
+          <w:hyperlink w:anchor="__RefHeading___Toc8643_1988885074">
             <w:r>
               <w:rPr>
                 <w:webHidden/>
@@ -475,7 +475,7 @@
             </w:tabs>
             <w:rPr/>
           </w:pPr>
-          <w:hyperlink w:anchor="__RefHeading___Toc8561_131033504">
+          <w:hyperlink w:anchor="__RefHeading___Toc8645_1988885074">
             <w:r>
               <w:rPr>
                 <w:webHidden/>
@@ -496,7 +496,7 @@
             </w:tabs>
             <w:rPr/>
           </w:pPr>
-          <w:hyperlink w:anchor="__RefHeading___Toc8563_131033504">
+          <w:hyperlink w:anchor="__RefHeading___Toc8647_1988885074">
             <w:r>
               <w:rPr>
                 <w:webHidden/>
@@ -517,7 +517,7 @@
             </w:tabs>
             <w:rPr/>
           </w:pPr>
-          <w:hyperlink w:anchor="__RefHeading___Toc8565_131033504">
+          <w:hyperlink w:anchor="__RefHeading___Toc8649_1988885074">
             <w:r>
               <w:rPr>
                 <w:webHidden/>
@@ -538,7 +538,7 @@
             </w:tabs>
             <w:rPr/>
           </w:pPr>
-          <w:hyperlink w:anchor="__RefHeading___Toc8567_131033504">
+          <w:hyperlink w:anchor="__RefHeading___Toc8651_1988885074">
             <w:r>
               <w:rPr>
                 <w:webHidden/>
@@ -559,7 +559,7 @@
             </w:tabs>
             <w:rPr/>
           </w:pPr>
-          <w:hyperlink w:anchor="__RefHeading___Toc8569_131033504">
+          <w:hyperlink w:anchor="__RefHeading___Toc8653_1988885074">
             <w:r>
               <w:rPr>
                 <w:webHidden/>
@@ -580,7 +580,7 @@
             </w:tabs>
             <w:rPr/>
           </w:pPr>
-          <w:hyperlink w:anchor="__RefHeading___Toc8571_131033504">
+          <w:hyperlink w:anchor="__RefHeading___Toc8655_1988885074">
             <w:r>
               <w:rPr>
                 <w:webHidden/>
@@ -601,7 +601,7 @@
             </w:tabs>
             <w:rPr/>
           </w:pPr>
-          <w:hyperlink w:anchor="__RefHeading___Toc8573_131033504">
+          <w:hyperlink w:anchor="__RefHeading___Toc8657_1988885074">
             <w:r>
               <w:rPr>
                 <w:webHidden/>
@@ -622,7 +622,7 @@
             </w:tabs>
             <w:rPr/>
           </w:pPr>
-          <w:hyperlink w:anchor="__RefHeading___Toc8575_131033504">
+          <w:hyperlink w:anchor="__RefHeading___Toc8659_1988885074">
             <w:r>
               <w:rPr>
                 <w:webHidden/>
@@ -643,7 +643,7 @@
             </w:tabs>
             <w:rPr/>
           </w:pPr>
-          <w:hyperlink w:anchor="__RefHeading___Toc8577_131033504">
+          <w:hyperlink w:anchor="__RefHeading___Toc8661_1988885074">
             <w:r>
               <w:rPr>
                 <w:webHidden/>
@@ -664,7 +664,7 @@
             </w:tabs>
             <w:rPr/>
           </w:pPr>
-          <w:hyperlink w:anchor="__RefHeading___Toc8579_131033504">
+          <w:hyperlink w:anchor="__RefHeading___Toc8663_1988885074">
             <w:r>
               <w:rPr>
                 <w:webHidden/>
@@ -685,7 +685,7 @@
             </w:tabs>
             <w:rPr/>
           </w:pPr>
-          <w:hyperlink w:anchor="__RefHeading___Toc8581_131033504">
+          <w:hyperlink w:anchor="__RefHeading___Toc8665_1988885074">
             <w:r>
               <w:rPr>
                 <w:webHidden/>
@@ -706,7 +706,7 @@
             </w:tabs>
             <w:rPr/>
           </w:pPr>
-          <w:hyperlink w:anchor="__RefHeading___Toc8583_131033504">
+          <w:hyperlink w:anchor="__RefHeading___Toc8667_1988885074">
             <w:r>
               <w:rPr>
                 <w:webHidden/>
@@ -727,7 +727,7 @@
             </w:tabs>
             <w:rPr/>
           </w:pPr>
-          <w:hyperlink w:anchor="__RefHeading___Toc8585_131033504">
+          <w:hyperlink w:anchor="__RefHeading___Toc8669_1988885074">
             <w:r>
               <w:rPr>
                 <w:webHidden/>
@@ -748,7 +748,7 @@
             </w:tabs>
             <w:rPr/>
           </w:pPr>
-          <w:hyperlink w:anchor="__RefHeading___Toc8587_131033504">
+          <w:hyperlink w:anchor="__RefHeading___Toc8671_1988885074">
             <w:r>
               <w:rPr>
                 <w:webHidden/>
@@ -769,7 +769,7 @@
             </w:tabs>
             <w:rPr/>
           </w:pPr>
-          <w:hyperlink w:anchor="__RefHeading___Toc8589_131033504">
+          <w:hyperlink w:anchor="__RefHeading___Toc8673_1988885074">
             <w:r>
               <w:rPr>
                 <w:webHidden/>
@@ -790,7 +790,7 @@
             </w:tabs>
             <w:rPr/>
           </w:pPr>
-          <w:hyperlink w:anchor="__RefHeading___Toc8591_131033504">
+          <w:hyperlink w:anchor="__RefHeading___Toc8675_1988885074">
             <w:r>
               <w:rPr>
                 <w:webHidden/>
@@ -811,7 +811,7 @@
             </w:tabs>
             <w:rPr/>
           </w:pPr>
-          <w:hyperlink w:anchor="__RefHeading___Toc8593_131033504">
+          <w:hyperlink w:anchor="__RefHeading___Toc8677_1988885074">
             <w:r>
               <w:rPr>
                 <w:webHidden/>
@@ -832,7 +832,7 @@
             </w:tabs>
             <w:rPr/>
           </w:pPr>
-          <w:hyperlink w:anchor="__RefHeading___Toc8595_131033504">
+          <w:hyperlink w:anchor="__RefHeading___Toc8679_1988885074">
             <w:r>
               <w:rPr>
                 <w:webHidden/>
@@ -840,7 +840,7 @@
               </w:rPr>
               <w:t>8.2 Performance Verification Hooks</w:t>
               <w:tab/>
-              <w:t>26</w:t>
+              <w:t>27</w:t>
             </w:r>
           </w:hyperlink>
         </w:p>
@@ -853,7 +853,7 @@
             </w:tabs>
             <w:rPr/>
           </w:pPr>
-          <w:hyperlink w:anchor="__RefHeading___Toc8597_131033504">
+          <w:hyperlink w:anchor="__RefHeading___Toc8681_1988885074">
             <w:r>
               <w:rPr>
                 <w:webHidden/>
@@ -874,7 +874,7 @@
             </w:tabs>
             <w:rPr/>
           </w:pPr>
-          <w:hyperlink w:anchor="__RefHeading___Toc8599_131033504">
+          <w:hyperlink w:anchor="__RefHeading___Toc8683_1988885074">
             <w:r>
               <w:rPr>
                 <w:webHidden/>
@@ -895,7 +895,7 @@
             </w:tabs>
             <w:rPr/>
           </w:pPr>
-          <w:hyperlink w:anchor="__RefHeading___Toc8601_131033504">
+          <w:hyperlink w:anchor="__RefHeading___Toc8685_1988885074">
             <w:r>
               <w:rPr>
                 <w:webHidden/>
@@ -916,7 +916,7 @@
             </w:tabs>
             <w:rPr/>
           </w:pPr>
-          <w:hyperlink w:anchor="__RefHeading___Toc8603_131033504">
+          <w:hyperlink w:anchor="__RefHeading___Toc8687_1988885074">
             <w:r>
               <w:rPr>
                 <w:webHidden/>
@@ -937,7 +937,7 @@
             </w:tabs>
             <w:rPr/>
           </w:pPr>
-          <w:hyperlink w:anchor="__RefHeading___Toc8605_131033504">
+          <w:hyperlink w:anchor="__RefHeading___Toc8689_1988885074">
             <w:r>
               <w:rPr>
                 <w:webHidden/>
@@ -958,7 +958,7 @@
             </w:tabs>
             <w:rPr/>
           </w:pPr>
-          <w:hyperlink w:anchor="__RefHeading___Toc8607_131033504">
+          <w:hyperlink w:anchor="__RefHeading___Toc8691_1988885074">
             <w:r>
               <w:rPr>
                 <w:webHidden/>
@@ -979,7 +979,7 @@
             </w:tabs>
             <w:rPr/>
           </w:pPr>
-          <w:hyperlink w:anchor="__RefHeading___Toc8609_131033504">
+          <w:hyperlink w:anchor="__RefHeading___Toc8693_1988885074">
             <w:r>
               <w:rPr>
                 <w:webHidden/>
@@ -1000,7 +1000,7 @@
             </w:tabs>
             <w:rPr/>
           </w:pPr>
-          <w:hyperlink w:anchor="__RefHeading___Toc8611_131033504">
+          <w:hyperlink w:anchor="__RefHeading___Toc8695_1988885074">
             <w:r>
               <w:rPr>
                 <w:webHidden/>
@@ -1021,7 +1021,7 @@
             </w:tabs>
             <w:rPr/>
           </w:pPr>
-          <w:hyperlink w:anchor="__RefHeading___Toc8613_131033504">
+          <w:hyperlink w:anchor="__RefHeading___Toc8697_1988885074">
             <w:r>
               <w:rPr>
                 <w:webHidden/>
@@ -1042,7 +1042,7 @@
             </w:tabs>
             <w:rPr/>
           </w:pPr>
-          <w:hyperlink w:anchor="__RefHeading___Toc8615_131033504">
+          <w:hyperlink w:anchor="__RefHeading___Toc8699_1988885074">
             <w:r>
               <w:rPr>
                 <w:webHidden/>
@@ -1063,7 +1063,7 @@
             </w:tabs>
             <w:rPr/>
           </w:pPr>
-          <w:hyperlink w:anchor="__RefHeading___Toc8617_131033504">
+          <w:hyperlink w:anchor="__RefHeading___Toc8701_1988885074">
             <w:r>
               <w:rPr>
                 <w:webHidden/>
@@ -1084,7 +1084,7 @@
             </w:tabs>
             <w:rPr/>
           </w:pPr>
-          <w:hyperlink w:anchor="__RefHeading___Toc8619_131033504">
+          <w:hyperlink w:anchor="__RefHeading___Toc8703_1988885074">
             <w:r>
               <w:rPr>
                 <w:webHidden/>
@@ -1105,7 +1105,7 @@
             </w:tabs>
             <w:rPr/>
           </w:pPr>
-          <w:hyperlink w:anchor="__RefHeading___Toc8621_131033504">
+          <w:hyperlink w:anchor="__RefHeading___Toc8705_1988885074">
             <w:r>
               <w:rPr>
                 <w:webHidden/>
@@ -1126,7 +1126,7 @@
             </w:tabs>
             <w:rPr/>
           </w:pPr>
-          <w:hyperlink w:anchor="__RefHeading___Toc8623_131033504">
+          <w:hyperlink w:anchor="__RefHeading___Toc8707_1988885074">
             <w:r>
               <w:rPr>
                 <w:webHidden/>
@@ -1147,7 +1147,7 @@
             </w:tabs>
             <w:rPr/>
           </w:pPr>
-          <w:hyperlink w:anchor="__RefHeading___Toc8625_131033504">
+          <w:hyperlink w:anchor="__RefHeading___Toc8709_1988885074">
             <w:r>
               <w:rPr>
                 <w:webHidden/>
@@ -1168,7 +1168,7 @@
             </w:tabs>
             <w:rPr/>
           </w:pPr>
-          <w:hyperlink w:anchor="__RefHeading___Toc8627_131033504">
+          <w:hyperlink w:anchor="__RefHeading___Toc8711_1988885074">
             <w:r>
               <w:rPr>
                 <w:webHidden/>
@@ -1189,7 +1189,7 @@
             </w:tabs>
             <w:rPr/>
           </w:pPr>
-          <w:hyperlink w:anchor="__RefHeading___Toc8629_131033504">
+          <w:hyperlink w:anchor="__RefHeading___Toc8713_1988885074">
             <w:r>
               <w:rPr>
                 <w:webHidden/>
@@ -1210,7 +1210,7 @@
             </w:tabs>
             <w:rPr/>
           </w:pPr>
-          <w:hyperlink w:anchor="__RefHeading___Toc8631_131033504">
+          <w:hyperlink w:anchor="__RefHeading___Toc8715_1988885074">
             <w:r>
               <w:rPr>
                 <w:webHidden/>
@@ -1231,7 +1231,7 @@
             </w:tabs>
             <w:rPr/>
           </w:pPr>
-          <w:hyperlink w:anchor="__RefHeading___Toc8633_131033504">
+          <w:hyperlink w:anchor="__RefHeading___Toc8717_1988885074">
             <w:r>
               <w:rPr>
                 <w:webHidden/>
@@ -1252,7 +1252,7 @@
             </w:tabs>
             <w:rPr/>
           </w:pPr>
-          <w:hyperlink w:anchor="__RefHeading___Toc8635_131033504">
+          <w:hyperlink w:anchor="__RefHeading___Toc8719_1988885074">
             <w:r>
               <w:rPr>
                 <w:webHidden/>
@@ -1273,7 +1273,7 @@
             </w:tabs>
             <w:rPr/>
           </w:pPr>
-          <w:hyperlink w:anchor="__RefHeading___Toc8637_131033504">
+          <w:hyperlink w:anchor="__RefHeading___Toc8721_1988885074">
             <w:r>
               <w:rPr>
                 <w:webHidden/>
@@ -1294,7 +1294,7 @@
             </w:tabs>
             <w:rPr/>
           </w:pPr>
-          <w:hyperlink w:anchor="__RefHeading___Toc8639_131033504">
+          <w:hyperlink w:anchor="__RefHeading___Toc8723_1988885074">
             <w:r>
               <w:rPr>
                 <w:webHidden/>
@@ -1315,7 +1315,7 @@
             </w:tabs>
             <w:rPr/>
           </w:pPr>
-          <w:hyperlink w:anchor="__RefHeading___Toc8641_131033504">
+          <w:hyperlink w:anchor="__RefHeading___Toc8725_1988885074">
             <w:r>
               <w:rPr>
                 <w:webHidden/>
@@ -1336,7 +1336,7 @@
             </w:tabs>
             <w:rPr/>
           </w:pPr>
-          <w:hyperlink w:anchor="__RefHeading___Toc8643_131033504">
+          <w:hyperlink w:anchor="__RefHeading___Toc8727_1988885074">
             <w:r>
               <w:rPr>
                 <w:webHidden/>
@@ -1357,7 +1357,7 @@
             </w:tabs>
             <w:rPr/>
           </w:pPr>
-          <w:hyperlink w:anchor="__RefHeading___Toc8645_131033504">
+          <w:hyperlink w:anchor="__RefHeading___Toc8729_1988885074">
             <w:r>
               <w:rPr>
                 <w:webHidden/>
@@ -1378,7 +1378,7 @@
             </w:tabs>
             <w:rPr/>
           </w:pPr>
-          <w:hyperlink w:anchor="__RefHeading___Toc8647_131033504">
+          <w:hyperlink w:anchor="__RefHeading___Toc8731_1988885074">
             <w:r>
               <w:rPr>
                 <w:webHidden/>
@@ -1399,7 +1399,7 @@
             </w:tabs>
             <w:rPr/>
           </w:pPr>
-          <w:hyperlink w:anchor="__RefHeading___Toc8649_131033504">
+          <w:hyperlink w:anchor="__RefHeading___Toc8733_1988885074">
             <w:r>
               <w:rPr>
                 <w:webHidden/>
@@ -1420,7 +1420,7 @@
             </w:tabs>
             <w:rPr/>
           </w:pPr>
-          <w:hyperlink w:anchor="__RefHeading___Toc8651_131033504">
+          <w:hyperlink w:anchor="__RefHeading___Toc8735_1988885074">
             <w:r>
               <w:rPr>
                 <w:webHidden/>
@@ -1441,7 +1441,7 @@
             </w:tabs>
             <w:rPr/>
           </w:pPr>
-          <w:hyperlink w:anchor="__RefHeading___Toc8653_131033504">
+          <w:hyperlink w:anchor="__RefHeading___Toc8737_1988885074">
             <w:r>
               <w:rPr>
                 <w:webHidden/>
@@ -1462,7 +1462,7 @@
             </w:tabs>
             <w:rPr/>
           </w:pPr>
-          <w:hyperlink w:anchor="__RefHeading___Toc8655_131033504">
+          <w:hyperlink w:anchor="__RefHeading___Toc8739_1988885074">
             <w:r>
               <w:rPr>
                 <w:webHidden/>
@@ -1483,7 +1483,7 @@
             </w:tabs>
             <w:rPr/>
           </w:pPr>
-          <w:hyperlink w:anchor="__RefHeading___Toc8657_131033504">
+          <w:hyperlink w:anchor="__RefHeading___Toc8741_1988885074">
             <w:r>
               <w:rPr>
                 <w:webHidden/>
@@ -1504,7 +1504,7 @@
             </w:tabs>
             <w:rPr/>
           </w:pPr>
-          <w:hyperlink w:anchor="__RefHeading___Toc8659_131033504">
+          <w:hyperlink w:anchor="__RefHeading___Toc8743_1988885074">
             <w:r>
               <w:rPr>
                 <w:webHidden/>
@@ -1525,7 +1525,7 @@
             </w:tabs>
             <w:rPr/>
           </w:pPr>
-          <w:hyperlink w:anchor="__RefHeading___Toc8661_131033504">
+          <w:hyperlink w:anchor="__RefHeading___Toc8745_1988885074">
             <w:r>
               <w:rPr>
                 <w:webHidden/>
@@ -1546,7 +1546,7 @@
             </w:tabs>
             <w:rPr/>
           </w:pPr>
-          <w:hyperlink w:anchor="__RefHeading___Toc8663_131033504">
+          <w:hyperlink w:anchor="__RefHeading___Toc8747_1988885074">
             <w:r>
               <w:rPr>
                 <w:webHidden/>
@@ -1567,7 +1567,7 @@
             </w:tabs>
             <w:rPr/>
           </w:pPr>
-          <w:hyperlink w:anchor="__RefHeading___Toc8665_131033504">
+          <w:hyperlink w:anchor="__RefHeading___Toc8749_1988885074">
             <w:r>
               <w:rPr>
                 <w:webHidden/>
@@ -1588,7 +1588,7 @@
             </w:tabs>
             <w:rPr/>
           </w:pPr>
-          <w:hyperlink w:anchor="__RefHeading___Toc8667_131033504">
+          <w:hyperlink w:anchor="__RefHeading___Toc8751_1988885074">
             <w:r>
               <w:rPr>
                 <w:webHidden/>
@@ -1609,7 +1609,7 @@
             </w:tabs>
             <w:rPr/>
           </w:pPr>
-          <w:hyperlink w:anchor="__RefHeading___Toc8669_131033504">
+          <w:hyperlink w:anchor="__RefHeading___Toc8753_1988885074">
             <w:r>
               <w:rPr>
                 <w:webHidden/>
@@ -1630,7 +1630,7 @@
             </w:tabs>
             <w:rPr/>
           </w:pPr>
-          <w:hyperlink w:anchor="__RefHeading___Toc8671_131033504">
+          <w:hyperlink w:anchor="__RefHeading___Toc8755_1988885074">
             <w:r>
               <w:rPr>
                 <w:webHidden/>
@@ -1651,7 +1651,7 @@
             </w:tabs>
             <w:rPr/>
           </w:pPr>
-          <w:hyperlink w:anchor="__RefHeading___Toc8673_131033504">
+          <w:hyperlink w:anchor="__RefHeading___Toc8757_1988885074">
             <w:r>
               <w:rPr>
                 <w:webHidden/>
@@ -1672,7 +1672,7 @@
             </w:tabs>
             <w:rPr/>
           </w:pPr>
-          <w:hyperlink w:anchor="__RefHeading___Toc8675_131033504">
+          <w:hyperlink w:anchor="__RefHeading___Toc8759_1988885074">
             <w:r>
               <w:rPr>
                 <w:webHidden/>
@@ -1693,7 +1693,7 @@
             </w:tabs>
             <w:rPr/>
           </w:pPr>
-          <w:hyperlink w:anchor="__RefHeading___Toc8677_131033504">
+          <w:hyperlink w:anchor="__RefHeading___Toc8761_1988885074">
             <w:r>
               <w:rPr>
                 <w:webHidden/>
@@ -1714,7 +1714,7 @@
             </w:tabs>
             <w:rPr/>
           </w:pPr>
-          <w:hyperlink w:anchor="__RefHeading___Toc8679_131033504">
+          <w:hyperlink w:anchor="__RefHeading___Toc8763_1988885074">
             <w:r>
               <w:rPr>
                 <w:webHidden/>
@@ -1735,7 +1735,7 @@
             </w:tabs>
             <w:rPr/>
           </w:pPr>
-          <w:hyperlink w:anchor="__RefHeading___Toc8681_131033504">
+          <w:hyperlink w:anchor="__RefHeading___Toc8765_1988885074">
             <w:r>
               <w:rPr>
                 <w:webHidden/>
@@ -1756,7 +1756,7 @@
             </w:tabs>
             <w:rPr/>
           </w:pPr>
-          <w:hyperlink w:anchor="__RefHeading___Toc8683_131033504">
+          <w:hyperlink w:anchor="__RefHeading___Toc8767_1988885074">
             <w:r>
               <w:rPr>
                 <w:webHidden/>
@@ -1777,7 +1777,7 @@
             </w:tabs>
             <w:rPr/>
           </w:pPr>
-          <w:hyperlink w:anchor="__RefHeading___Toc8685_131033504">
+          <w:hyperlink w:anchor="__RefHeading___Toc8769_1988885074">
             <w:r>
               <w:rPr>
                 <w:webHidden/>
@@ -1798,7 +1798,7 @@
             </w:tabs>
             <w:rPr/>
           </w:pPr>
-          <w:hyperlink w:anchor="__RefHeading___Toc8687_131033504">
+          <w:hyperlink w:anchor="__RefHeading___Toc8771_1988885074">
             <w:r>
               <w:rPr>
                 <w:webHidden/>
@@ -1819,7 +1819,7 @@
             </w:tabs>
             <w:rPr/>
           </w:pPr>
-          <w:hyperlink w:anchor="__RefHeading___Toc8689_131033504">
+          <w:hyperlink w:anchor="__RefHeading___Toc8773_1988885074">
             <w:r>
               <w:rPr>
                 <w:webHidden/>
@@ -1840,7 +1840,7 @@
             </w:tabs>
             <w:rPr/>
           </w:pPr>
-          <w:hyperlink w:anchor="__RefHeading___Toc8691_131033504">
+          <w:hyperlink w:anchor="__RefHeading___Toc8775_1988885074">
             <w:r>
               <w:rPr>
                 <w:webHidden/>
@@ -1861,7 +1861,7 @@
             </w:tabs>
             <w:rPr/>
           </w:pPr>
-          <w:hyperlink w:anchor="__RefHeading___Toc8693_131033504">
+          <w:hyperlink w:anchor="__RefHeading___Toc8777_1988885074">
             <w:r>
               <w:rPr>
                 <w:webHidden/>
@@ -1882,7 +1882,7 @@
             </w:tabs>
             <w:rPr/>
           </w:pPr>
-          <w:hyperlink w:anchor="__RefHeading___Toc8695_131033504">
+          <w:hyperlink w:anchor="__RefHeading___Toc8779_1988885074">
             <w:r>
               <w:rPr>
                 <w:webHidden/>
@@ -1903,7 +1903,7 @@
             </w:tabs>
             <w:rPr/>
           </w:pPr>
-          <w:hyperlink w:anchor="__RefHeading___Toc8697_131033504">
+          <w:hyperlink w:anchor="__RefHeading___Toc8781_1988885074">
             <w:r>
               <w:rPr>
                 <w:webHidden/>
@@ -1924,7 +1924,7 @@
             </w:tabs>
             <w:rPr/>
           </w:pPr>
-          <w:hyperlink w:anchor="__RefHeading___Toc8699_131033504">
+          <w:hyperlink w:anchor="__RefHeading___Toc8783_1988885074">
             <w:r>
               <w:rPr>
                 <w:webHidden/>
@@ -1945,7 +1945,7 @@
             </w:tabs>
             <w:rPr/>
           </w:pPr>
-          <w:hyperlink w:anchor="__RefHeading___Toc8701_131033504">
+          <w:hyperlink w:anchor="__RefHeading___Toc8785_1988885074">
             <w:r>
               <w:rPr>
                 <w:webHidden/>
@@ -1966,7 +1966,7 @@
             </w:tabs>
             <w:rPr/>
           </w:pPr>
-          <w:hyperlink w:anchor="__RefHeading___Toc8703_131033504">
+          <w:hyperlink w:anchor="__RefHeading___Toc8787_1988885074">
             <w:r>
               <w:rPr>
                 <w:webHidden/>
@@ -1987,7 +1987,7 @@
             </w:tabs>
             <w:rPr/>
           </w:pPr>
-          <w:hyperlink w:anchor="__RefHeading___Toc8705_131033504">
+          <w:hyperlink w:anchor="__RefHeading___Toc8789_1988885074">
             <w:r>
               <w:rPr>
                 <w:webHidden/>
@@ -2008,7 +2008,7 @@
             </w:tabs>
             <w:rPr/>
           </w:pPr>
-          <w:hyperlink w:anchor="__RefHeading___Toc8707_131033504">
+          <w:hyperlink w:anchor="__RefHeading___Toc8791_1988885074">
             <w:r>
               <w:rPr>
                 <w:webHidden/>
@@ -2029,7 +2029,7 @@
             </w:tabs>
             <w:rPr/>
           </w:pPr>
-          <w:hyperlink w:anchor="__RefHeading___Toc8709_131033504">
+          <w:hyperlink w:anchor="__RefHeading___Toc8793_1988885074">
             <w:r>
               <w:rPr>
                 <w:webHidden/>
@@ -2050,7 +2050,7 @@
             </w:tabs>
             <w:rPr/>
           </w:pPr>
-          <w:hyperlink w:anchor="__RefHeading___Toc8711_131033504">
+          <w:hyperlink w:anchor="__RefHeading___Toc8795_1988885074">
             <w:r>
               <w:rPr>
                 <w:webHidden/>
@@ -2071,7 +2071,7 @@
             </w:tabs>
             <w:rPr/>
           </w:pPr>
-          <w:hyperlink w:anchor="__RefHeading___Toc8713_131033504">
+          <w:hyperlink w:anchor="__RefHeading___Toc8797_1988885074">
             <w:r>
               <w:rPr>
                 <w:webHidden/>
@@ -2092,7 +2092,7 @@
             </w:tabs>
             <w:rPr/>
           </w:pPr>
-          <w:hyperlink w:anchor="__RefHeading___Toc8715_131033504">
+          <w:hyperlink w:anchor="__RefHeading___Toc8799_1988885074">
             <w:r>
               <w:rPr>
                 <w:webHidden/>
@@ -2113,7 +2113,7 @@
             </w:tabs>
             <w:rPr/>
           </w:pPr>
-          <w:hyperlink w:anchor="__RefHeading___Toc8717_131033504">
+          <w:hyperlink w:anchor="__RefHeading___Toc8801_1988885074">
             <w:r>
               <w:rPr>
                 <w:webHidden/>
@@ -2134,7 +2134,7 @@
             </w:tabs>
             <w:rPr/>
           </w:pPr>
-          <w:hyperlink w:anchor="__RefHeading___Toc8719_131033504">
+          <w:hyperlink w:anchor="__RefHeading___Toc8803_1988885074">
             <w:r>
               <w:rPr>
                 <w:webHidden/>
@@ -2155,7 +2155,7 @@
             </w:tabs>
             <w:rPr/>
           </w:pPr>
-          <w:hyperlink w:anchor="__RefHeading___Toc8721_131033504">
+          <w:hyperlink w:anchor="__RefHeading___Toc8805_1988885074">
             <w:r>
               <w:rPr>
                 <w:webHidden/>
@@ -2176,7 +2176,7 @@
             </w:tabs>
             <w:rPr/>
           </w:pPr>
-          <w:hyperlink w:anchor="__RefHeading___Toc8723_131033504">
+          <w:hyperlink w:anchor="__RefHeading___Toc8807_1988885074">
             <w:r>
               <w:rPr>
                 <w:webHidden/>
@@ -2197,7 +2197,7 @@
             </w:tabs>
             <w:rPr/>
           </w:pPr>
-          <w:hyperlink w:anchor="__RefHeading___Toc8725_131033504">
+          <w:hyperlink w:anchor="__RefHeading___Toc8809_1988885074">
             <w:r>
               <w:rPr>
                 <w:webHidden/>
@@ -2218,7 +2218,7 @@
             </w:tabs>
             <w:rPr/>
           </w:pPr>
-          <w:hyperlink w:anchor="__RefHeading___Toc8727_131033504">
+          <w:hyperlink w:anchor="__RefHeading___Toc8811_1988885074">
             <w:r>
               <w:rPr>
                 <w:webHidden/>
@@ -2239,7 +2239,7 @@
             </w:tabs>
             <w:rPr/>
           </w:pPr>
-          <w:hyperlink w:anchor="__RefHeading___Toc8729_131033504">
+          <w:hyperlink w:anchor="__RefHeading___Toc8813_1988885074">
             <w:r>
               <w:rPr>
                 <w:webHidden/>
@@ -2260,7 +2260,7 @@
             </w:tabs>
             <w:rPr/>
           </w:pPr>
-          <w:hyperlink w:anchor="__RefHeading___Toc8731_131033504">
+          <w:hyperlink w:anchor="__RefHeading___Toc8815_1988885074">
             <w:r>
               <w:rPr>
                 <w:webHidden/>
@@ -2281,7 +2281,7 @@
             </w:tabs>
             <w:rPr/>
           </w:pPr>
-          <w:hyperlink w:anchor="__RefHeading___Toc8733_131033504">
+          <w:hyperlink w:anchor="__RefHeading___Toc8817_1988885074">
             <w:r>
               <w:rPr>
                 <w:webHidden/>
@@ -2302,7 +2302,7 @@
             </w:tabs>
             <w:rPr/>
           </w:pPr>
-          <w:hyperlink w:anchor="__RefHeading___Toc8735_131033504">
+          <w:hyperlink w:anchor="__RefHeading___Toc8819_1988885074">
             <w:r>
               <w:rPr>
                 <w:webHidden/>
@@ -2323,7 +2323,7 @@
             </w:tabs>
             <w:rPr/>
           </w:pPr>
-          <w:hyperlink w:anchor="__RefHeading___Toc8737_131033504">
+          <w:hyperlink w:anchor="__RefHeading___Toc8821_1988885074">
             <w:r>
               <w:rPr>
                 <w:webHidden/>
@@ -2344,7 +2344,7 @@
             </w:tabs>
             <w:rPr/>
           </w:pPr>
-          <w:hyperlink w:anchor="__RefHeading___Toc8739_131033504">
+          <w:hyperlink w:anchor="__RefHeading___Toc8823_1988885074">
             <w:r>
               <w:rPr>
                 <w:webHidden/>
@@ -2365,7 +2365,7 @@
             </w:tabs>
             <w:rPr/>
           </w:pPr>
-          <w:hyperlink w:anchor="__RefHeading___Toc8741_131033504">
+          <w:hyperlink w:anchor="__RefHeading___Toc8825_1988885074">
             <w:r>
               <w:rPr>
                 <w:webHidden/>
@@ -2386,7 +2386,7 @@
             </w:tabs>
             <w:rPr/>
           </w:pPr>
-          <w:hyperlink w:anchor="__RefHeading___Toc8743_131033504">
+          <w:hyperlink w:anchor="__RefHeading___Toc8827_1988885074">
             <w:r>
               <w:rPr>
                 <w:webHidden/>
@@ -2407,7 +2407,7 @@
             </w:tabs>
             <w:rPr/>
           </w:pPr>
-          <w:hyperlink w:anchor="__RefHeading___Toc8745_131033504">
+          <w:hyperlink w:anchor="__RefHeading___Toc8829_1988885074">
             <w:r>
               <w:rPr>
                 <w:webHidden/>
@@ -2428,7 +2428,7 @@
             </w:tabs>
             <w:rPr/>
           </w:pPr>
-          <w:hyperlink w:anchor="__RefHeading___Toc8747_131033504">
+          <w:hyperlink w:anchor="__RefHeading___Toc8831_1988885074">
             <w:r>
               <w:rPr>
                 <w:webHidden/>
@@ -2449,7 +2449,7 @@
             </w:tabs>
             <w:rPr/>
           </w:pPr>
-          <w:hyperlink w:anchor="__RefHeading___Toc8749_131033504">
+          <w:hyperlink w:anchor="__RefHeading___Toc8833_1988885074">
             <w:r>
               <w:rPr>
                 <w:webHidden/>
@@ -2470,7 +2470,7 @@
             </w:tabs>
             <w:rPr/>
           </w:pPr>
-          <w:hyperlink w:anchor="__RefHeading___Toc8751_131033504">
+          <w:hyperlink w:anchor="__RefHeading___Toc8835_1988885074">
             <w:r>
               <w:rPr>
                 <w:webHidden/>
@@ -2491,7 +2491,7 @@
             </w:tabs>
             <w:rPr/>
           </w:pPr>
-          <w:hyperlink w:anchor="__RefHeading___Toc8753_131033504">
+          <w:hyperlink w:anchor="__RefHeading___Toc8837_1988885074">
             <w:r>
               <w:rPr>
                 <w:webHidden/>
@@ -2512,7 +2512,7 @@
             </w:tabs>
             <w:rPr/>
           </w:pPr>
-          <w:hyperlink w:anchor="__RefHeading___Toc8755_131033504">
+          <w:hyperlink w:anchor="__RefHeading___Toc8839_1988885074">
             <w:r>
               <w:rPr>
                 <w:webHidden/>
@@ -2533,7 +2533,7 @@
             </w:tabs>
             <w:rPr/>
           </w:pPr>
-          <w:hyperlink w:anchor="__RefHeading___Toc8757_131033504">
+          <w:hyperlink w:anchor="__RefHeading___Toc8841_1988885074">
             <w:r>
               <w:rPr>
                 <w:webHidden/>
@@ -2554,7 +2554,7 @@
             </w:tabs>
             <w:rPr/>
           </w:pPr>
-          <w:hyperlink w:anchor="__RefHeading___Toc8759_131033504">
+          <w:hyperlink w:anchor="__RefHeading___Toc8843_1988885074">
             <w:r>
               <w:rPr>
                 <w:webHidden/>
@@ -2575,7 +2575,7 @@
             </w:tabs>
             <w:rPr/>
           </w:pPr>
-          <w:hyperlink w:anchor="__RefHeading___Toc8761_131033504">
+          <w:hyperlink w:anchor="__RefHeading___Toc8845_1988885074">
             <w:r>
               <w:rPr>
                 <w:webHidden/>
@@ -2596,7 +2596,7 @@
             </w:tabs>
             <w:rPr/>
           </w:pPr>
-          <w:hyperlink w:anchor="__RefHeading___Toc8763_131033504">
+          <w:hyperlink w:anchor="__RefHeading___Toc8847_1988885074">
             <w:r>
               <w:rPr>
                 <w:webHidden/>
@@ -2617,7 +2617,7 @@
             </w:tabs>
             <w:rPr/>
           </w:pPr>
-          <w:hyperlink w:anchor="__RefHeading___Toc8765_131033504">
+          <w:hyperlink w:anchor="__RefHeading___Toc8849_1988885074">
             <w:r>
               <w:rPr>
                 <w:webHidden/>
@@ -2638,7 +2638,7 @@
             </w:tabs>
             <w:rPr/>
           </w:pPr>
-          <w:hyperlink w:anchor="__RefHeading___Toc8767_131033504">
+          <w:hyperlink w:anchor="__RefHeading___Toc8851_1988885074">
             <w:r>
               <w:rPr>
                 <w:webHidden/>
@@ -2659,7 +2659,7 @@
             </w:tabs>
             <w:rPr/>
           </w:pPr>
-          <w:hyperlink w:anchor="__RefHeading___Toc8769_131033504">
+          <w:hyperlink w:anchor="__RefHeading___Toc8853_1988885074">
             <w:r>
               <w:rPr>
                 <w:webHidden/>
@@ -2680,7 +2680,7 @@
             </w:tabs>
             <w:rPr/>
           </w:pPr>
-          <w:hyperlink w:anchor="__RefHeading___Toc8771_131033504">
+          <w:hyperlink w:anchor="__RefHeading___Toc8855_1988885074">
             <w:r>
               <w:rPr>
                 <w:webHidden/>
@@ -2701,7 +2701,7 @@
             </w:tabs>
             <w:rPr/>
           </w:pPr>
-          <w:hyperlink w:anchor="__RefHeading___Toc8773_131033504">
+          <w:hyperlink w:anchor="__RefHeading___Toc8857_1988885074">
             <w:r>
               <w:rPr>
                 <w:webHidden/>
@@ -2722,7 +2722,7 @@
             </w:tabs>
             <w:rPr/>
           </w:pPr>
-          <w:hyperlink w:anchor="__RefHeading___Toc8775_131033504">
+          <w:hyperlink w:anchor="__RefHeading___Toc8859_1988885074">
             <w:r>
               <w:rPr>
                 <w:webHidden/>
@@ -2743,7 +2743,7 @@
             </w:tabs>
             <w:rPr/>
           </w:pPr>
-          <w:hyperlink w:anchor="__RefHeading___Toc8777_131033504">
+          <w:hyperlink w:anchor="__RefHeading___Toc8861_1988885074">
             <w:r>
               <w:rPr>
                 <w:webHidden/>
@@ -2764,7 +2764,7 @@
             </w:tabs>
             <w:rPr/>
           </w:pPr>
-          <w:hyperlink w:anchor="__RefHeading___Toc8779_131033504">
+          <w:hyperlink w:anchor="__RefHeading___Toc8863_1988885074">
             <w:r>
               <w:rPr>
                 <w:webHidden/>
@@ -2785,7 +2785,7 @@
             </w:tabs>
             <w:rPr/>
           </w:pPr>
-          <w:hyperlink w:anchor="__RefHeading___Toc8781_131033504">
+          <w:hyperlink w:anchor="__RefHeading___Toc8865_1988885074">
             <w:r>
               <w:rPr>
                 <w:webHidden/>
@@ -2806,7 +2806,7 @@
             </w:tabs>
             <w:rPr/>
           </w:pPr>
-          <w:hyperlink w:anchor="__RefHeading___Toc8783_131033504">
+          <w:hyperlink w:anchor="__RefHeading___Toc8867_1988885074">
             <w:r>
               <w:rPr>
                 <w:webHidden/>
@@ -2827,7 +2827,7 @@
             </w:tabs>
             <w:rPr/>
           </w:pPr>
-          <w:hyperlink w:anchor="__RefHeading___Toc8785_131033504">
+          <w:hyperlink w:anchor="__RefHeading___Toc8869_1988885074">
             <w:r>
               <w:rPr>
                 <w:webHidden/>
@@ -2848,7 +2848,7 @@
             </w:tabs>
             <w:rPr/>
           </w:pPr>
-          <w:hyperlink w:anchor="__RefHeading___Toc8787_131033504">
+          <w:hyperlink w:anchor="__RefHeading___Toc8871_1988885074">
             <w:r>
               <w:rPr>
                 <w:webHidden/>
@@ -2869,7 +2869,7 @@
             </w:tabs>
             <w:rPr/>
           </w:pPr>
-          <w:hyperlink w:anchor="__RefHeading___Toc8789_131033504">
+          <w:hyperlink w:anchor="__RefHeading___Toc8873_1988885074">
             <w:r>
               <w:rPr>
                 <w:webHidden/>
@@ -2890,7 +2890,7 @@
             </w:tabs>
             <w:rPr/>
           </w:pPr>
-          <w:hyperlink w:anchor="__RefHeading___Toc8791_131033504">
+          <w:hyperlink w:anchor="__RefHeading___Toc8875_1988885074">
             <w:r>
               <w:rPr>
                 <w:webHidden/>
@@ -2911,7 +2911,7 @@
             </w:tabs>
             <w:rPr/>
           </w:pPr>
-          <w:hyperlink w:anchor="__RefHeading___Toc8793_131033504">
+          <w:hyperlink w:anchor="__RefHeading___Toc8877_1988885074">
             <w:r>
               <w:rPr>
                 <w:webHidden/>
@@ -2932,7 +2932,7 @@
             </w:tabs>
             <w:rPr/>
           </w:pPr>
-          <w:hyperlink w:anchor="__RefHeading___Toc8795_131033504">
+          <w:hyperlink w:anchor="__RefHeading___Toc8879_1988885074">
             <w:r>
               <w:rPr>
                 <w:webHidden/>
@@ -2953,7 +2953,7 @@
             </w:tabs>
             <w:rPr/>
           </w:pPr>
-          <w:hyperlink w:anchor="__RefHeading___Toc8797_131033504">
+          <w:hyperlink w:anchor="__RefHeading___Toc8881_1988885074">
             <w:r>
               <w:rPr>
                 <w:webHidden/>
@@ -2974,7 +2974,7 @@
             </w:tabs>
             <w:rPr/>
           </w:pPr>
-          <w:hyperlink w:anchor="__RefHeading___Toc8799_131033504">
+          <w:hyperlink w:anchor="__RefHeading___Toc8883_1988885074">
             <w:r>
               <w:rPr>
                 <w:webHidden/>
@@ -2995,7 +2995,7 @@
             </w:tabs>
             <w:rPr/>
           </w:pPr>
-          <w:hyperlink w:anchor="__RefHeading___Toc8801_131033504">
+          <w:hyperlink w:anchor="__RefHeading___Toc8885_1988885074">
             <w:r>
               <w:rPr>
                 <w:webHidden/>
@@ -3016,7 +3016,7 @@
             </w:tabs>
             <w:rPr/>
           </w:pPr>
-          <w:hyperlink w:anchor="__RefHeading___Toc8803_131033504">
+          <w:hyperlink w:anchor="__RefHeading___Toc8887_1988885074">
             <w:r>
               <w:rPr>
                 <w:webHidden/>
@@ -3037,7 +3037,7 @@
             </w:tabs>
             <w:rPr/>
           </w:pPr>
-          <w:hyperlink w:anchor="__RefHeading___Toc8805_131033504">
+          <w:hyperlink w:anchor="__RefHeading___Toc8889_1988885074">
             <w:r>
               <w:rPr>
                 <w:webHidden/>
@@ -3058,7 +3058,7 @@
             </w:tabs>
             <w:rPr/>
           </w:pPr>
-          <w:hyperlink w:anchor="__RefHeading___Toc8807_131033504">
+          <w:hyperlink w:anchor="__RefHeading___Toc8891_1988885074">
             <w:r>
               <w:rPr>
                 <w:webHidden/>
@@ -3079,7 +3079,7 @@
             </w:tabs>
             <w:rPr/>
           </w:pPr>
-          <w:hyperlink w:anchor="__RefHeading___Toc8809_131033504">
+          <w:hyperlink w:anchor="__RefHeading___Toc8893_1988885074">
             <w:r>
               <w:rPr>
                 <w:webHidden/>
@@ -3100,7 +3100,7 @@
             </w:tabs>
             <w:rPr/>
           </w:pPr>
-          <w:hyperlink w:anchor="__RefHeading___Toc8811_131033504">
+          <w:hyperlink w:anchor="__RefHeading___Toc8895_1988885074">
             <w:r>
               <w:rPr>
                 <w:webHidden/>
@@ -3121,7 +3121,7 @@
             </w:tabs>
             <w:rPr/>
           </w:pPr>
-          <w:hyperlink w:anchor="__RefHeading___Toc8813_131033504">
+          <w:hyperlink w:anchor="__RefHeading___Toc8897_1988885074">
             <w:r>
               <w:rPr>
                 <w:webHidden/>
@@ -3142,7 +3142,7 @@
             </w:tabs>
             <w:rPr/>
           </w:pPr>
-          <w:hyperlink w:anchor="__RefHeading___Toc8815_131033504">
+          <w:hyperlink w:anchor="__RefHeading___Toc8899_1988885074">
             <w:r>
               <w:rPr>
                 <w:webHidden/>
@@ -3163,7 +3163,7 @@
             </w:tabs>
             <w:rPr/>
           </w:pPr>
-          <w:hyperlink w:anchor="__RefHeading___Toc8817_131033504">
+          <w:hyperlink w:anchor="__RefHeading___Toc8901_1988885074">
             <w:r>
               <w:rPr>
                 <w:webHidden/>
@@ -3184,7 +3184,7 @@
             </w:tabs>
             <w:rPr/>
           </w:pPr>
-          <w:hyperlink w:anchor="__RefHeading___Toc8819_131033504">
+          <w:hyperlink w:anchor="__RefHeading___Toc8903_1988885074">
             <w:r>
               <w:rPr>
                 <w:webHidden/>
@@ -3205,7 +3205,7 @@
             </w:tabs>
             <w:rPr/>
           </w:pPr>
-          <w:hyperlink w:anchor="__RefHeading___Toc8821_131033504">
+          <w:hyperlink w:anchor="__RefHeading___Toc8905_1988885074">
             <w:r>
               <w:rPr>
                 <w:webHidden/>
@@ -3226,7 +3226,7 @@
             </w:tabs>
             <w:rPr/>
           </w:pPr>
-          <w:hyperlink w:anchor="__RefHeading___Toc8823_131033504">
+          <w:hyperlink w:anchor="__RefHeading___Toc8907_1988885074">
             <w:r>
               <w:rPr>
                 <w:webHidden/>
@@ -3247,7 +3247,7 @@
             </w:tabs>
             <w:rPr/>
           </w:pPr>
-          <w:hyperlink w:anchor="__RefHeading___Toc8825_131033504">
+          <w:hyperlink w:anchor="__RefHeading___Toc8909_1988885074">
             <w:r>
               <w:rPr>
                 <w:webHidden/>
@@ -3268,7 +3268,7 @@
             </w:tabs>
             <w:rPr/>
           </w:pPr>
-          <w:hyperlink w:anchor="__RefHeading___Toc8827_131033504">
+          <w:hyperlink w:anchor="__RefHeading___Toc8911_1988885074">
             <w:r>
               <w:rPr>
                 <w:webHidden/>
@@ -3289,7 +3289,7 @@
             </w:tabs>
             <w:rPr/>
           </w:pPr>
-          <w:hyperlink w:anchor="__RefHeading___Toc8829_131033504">
+          <w:hyperlink w:anchor="__RefHeading___Toc8913_1988885074">
             <w:r>
               <w:rPr>
                 <w:webHidden/>
@@ -3310,7 +3310,7 @@
             </w:tabs>
             <w:rPr/>
           </w:pPr>
-          <w:hyperlink w:anchor="__RefHeading___Toc8831_131033504">
+          <w:hyperlink w:anchor="__RefHeading___Toc8915_1988885074">
             <w:r>
               <w:rPr>
                 <w:webHidden/>
@@ -3619,7 +3619,7 @@
           <w:rPr>
             <w:rStyle w:val="ListLabel1"/>
           </w:rPr>
-          <w:t>15</w:t>
+          <w:t>16</w:t>
         </w:r>
         <w:r>
           <w:rPr>
@@ -4389,7 +4389,7 @@
         <w:spacing w:before="0" w:after="120"/>
         <w:rPr/>
       </w:pPr>
-      <w:bookmarkStart w:id="2" w:name="__RefHeading___Toc8531_131033504"/>
+      <w:bookmarkStart w:id="2" w:name="__RefHeading___Toc8615_1988885074"/>
       <w:bookmarkEnd w:id="2"/>
       <w:r>
         <w:rPr>
@@ -4527,7 +4527,7 @@
         <w:spacing w:before="360" w:after="120"/>
         <w:rPr/>
       </w:pPr>
-      <w:bookmarkStart w:id="4" w:name="__RefHeading___Toc8533_131033504"/>
+      <w:bookmarkStart w:id="4" w:name="__RefHeading___Toc8617_1988885074"/>
       <w:bookmarkStart w:id="5" w:name="document-information"/>
       <w:bookmarkEnd w:id="4"/>
       <w:r>
@@ -4558,7 +4558,7 @@
         <w:spacing w:before="280" w:after="80"/>
         <w:rPr/>
       </w:pPr>
-      <w:bookmarkStart w:id="6" w:name="__RefHeading___Toc8535_131033504"/>
+      <w:bookmarkStart w:id="6" w:name="__RefHeading___Toc8619_1988885074"/>
       <w:bookmarkStart w:id="7" w:name="hive-micro-architecture-specification"/>
       <w:bookmarkEnd w:id="6"/>
       <w:r>
@@ -4714,7 +4714,7 @@
         <w:spacing w:before="280" w:after="80"/>
         <w:rPr/>
       </w:pPr>
-      <w:bookmarkStart w:id="9" w:name="__RefHeading___Toc8537_131033504"/>
+      <w:bookmarkStart w:id="9" w:name="__RefHeading___Toc8621_1988885074"/>
       <w:bookmarkStart w:id="10" w:name="document-purpose"/>
       <w:bookmarkEnd w:id="9"/>
       <w:r>
@@ -4852,7 +4852,7 @@
         <w:spacing w:before="280" w:after="80"/>
         <w:rPr/>
       </w:pPr>
-      <w:bookmarkStart w:id="12" w:name="__RefHeading___Toc8539_131033504"/>
+      <w:bookmarkStart w:id="12" w:name="__RefHeading___Toc8623_1988885074"/>
       <w:bookmarkStart w:id="13" w:name="references"/>
       <w:bookmarkEnd w:id="12"/>
       <w:r>
@@ -5748,7 +5748,7 @@
         <w:spacing w:before="280" w:after="80"/>
         <w:rPr/>
       </w:pPr>
-      <w:bookmarkStart w:id="16" w:name="__RefHeading___Toc8541_131033504"/>
+      <w:bookmarkStart w:id="16" w:name="__RefHeading___Toc8625_1988885074"/>
       <w:bookmarkStart w:id="17" w:name="terminology"/>
       <w:bookmarkEnd w:id="16"/>
       <w:r>
@@ -6341,7 +6341,7 @@
         <w:spacing w:before="280" w:after="80"/>
         <w:rPr/>
       </w:pPr>
-      <w:bookmarkStart w:id="20" w:name="__RefHeading___Toc8543_131033504"/>
+      <w:bookmarkStart w:id="20" w:name="__RefHeading___Toc8627_1988885074"/>
       <w:bookmarkStart w:id="21" w:name="revision-history"/>
       <w:bookmarkEnd w:id="20"/>
       <w:r>
@@ -6814,7 +6814,27 @@
                 <w:szCs w:val="24"/>
                 <w:lang w:val="en-US" w:eastAsia="en-US" w:bidi="ar-SA"/>
               </w:rPr>
-              <w:t>Owner decisions: quiesce status via fabric IDLE signal into a PeakRDL config register (hard interlock demoted to optional hardening); kestrel loader pattern; dual-flop tap synchronizers; descriptor mailbox parameter-controlled, dedicated register file default, custom-instruction alternative rejected; PKT_CONFIG injection path still TBD</w:t>
+              <w:t xml:space="preserve">Owner decisions: quiesce status via fabric IDLE signal into a PeakRDL config register (hard interlock demoted to optional hardening); kestrel loader pattern; dual-flop tap synchronizers; descriptor mailbox parameter-controlled, dedicated register file default, custom-instruction alternative rejected; PKT_CONFIG injection path still TBD. Addendum: delta is the fabric (owner); everything that leaves a block is a stream — control network AXIS-shaped (32-bit, </w:t>
+            </w:r>
+            <w:r>
+              <w:rPr>
+                <w:rStyle w:val="VerbatimChar"/>
+                <w:rFonts w:eastAsia="Cambria" w:cs=""/>
+                <w:kern w:val="0"/>
+                <w:szCs w:val="24"/>
+                <w:lang w:val="en-US" w:eastAsia="en-US" w:bidi="ar-SA"/>
+              </w:rPr>
+              <w:t>tuser[0]</w:t>
+            </w:r>
+            <w:r>
+              <w:rPr>
+                <w:rFonts w:eastAsia="Cambria" w:cs=""/>
+                <w:kern w:val="0"/>
+                <w:sz w:val="24"/>
+                <w:szCs w:val="24"/>
+                <w:lang w:val="en-US" w:eastAsia="en-US" w:bidi="ar-SA"/>
+              </w:rPr>
+              <w:t xml:space="preserve"> urgent), no AXI4 full in HIVE</w:t>
             </w:r>
           </w:p>
         </w:tc>
@@ -7000,7 +7020,7 @@
         <w:spacing w:before="360" w:after="120"/>
         <w:rPr/>
       </w:pPr>
-      <w:bookmarkStart w:id="25" w:name="__RefHeading___Toc8545_131033504"/>
+      <w:bookmarkStart w:id="25" w:name="__RefHeading___Toc8629_1988885074"/>
       <w:bookmarkStart w:id="26" w:name="X99742a33fcbc74d6a9e40b7eb13eeb40da76a3c"/>
       <w:bookmarkEnd w:id="25"/>
       <w:r>
@@ -7031,7 +7051,7 @@
         <w:spacing w:before="280" w:after="80"/>
         <w:rPr/>
       </w:pPr>
-      <w:bookmarkStart w:id="27" w:name="__RefHeading___Toc8547_131033504"/>
+      <w:bookmarkStart w:id="27" w:name="__RefHeading___Toc8631_1988885074"/>
       <w:bookmarkStart w:id="28" w:name="philosophy"/>
       <w:bookmarkEnd w:id="27"/>
       <w:r>
@@ -7214,6 +7234,83 @@
         </w:rPr>
         <w:t>) and the cocotb testbenches need, on dedicated observation ports that are part of the module interface — never tapped ad hoc from internals.</w:t>
       </w:r>
+    </w:p>
+    <w:p>
+      <w:pPr>
+        <w:pStyle w:val="Normal"/>
+        <w:numPr>
+          <w:ilvl w:val="0"/>
+          <w:numId w:val="1"/>
+        </w:numPr>
+        <w:rPr/>
+      </w:pPr>
+      <w:r>
+        <w:rPr>
+          <w:b/>
+          <w:bCs/>
+          <w:sz w:val="20"/>
+        </w:rPr>
+        <w:t>Everything that leaves a block is a stream</w:t>
+      </w:r>
+      <w:r>
+        <w:rPr>
+          <w:sz w:val="20"/>
+        </w:rPr>
+        <w:t xml:space="preserve"> (owner, 2026-10-13). All fabric-facing traffic is AXI4-Stream; the internal control network is AXIS-shaped (32-bit frames on </w:t>
+      </w:r>
+      <w:r>
+        <w:rPr>
+          <w:rStyle w:val="VerbatimChar"/>
+          <w:sz w:val="20"/>
+        </w:rPr>
+        <w:t>tvalid/tready/tlast</w:t>
+      </w:r>
+      <w:r>
+        <w:rPr>
+          <w:sz w:val="20"/>
+        </w:rPr>
+        <w:t xml:space="preserve">, </w:t>
+      </w:r>
+      <w:r>
+        <w:rPr>
+          <w:rStyle w:val="VerbatimChar"/>
+          <w:sz w:val="20"/>
+        </w:rPr>
+        <w:t>tuser[0]</w:t>
+      </w:r>
+      <w:r>
+        <w:rPr>
+          <w:sz w:val="20"/>
+        </w:rPr>
+        <w:t xml:space="preserve"> = urgent flag). Only register files are memory-mapped (AXI4-Lite). No AXI4 full anywhere in HIVE — it never touches DDR and moves no burst traffic. Rationale: delta speaks AXIS natively; inband descriptor injection only exists on the stream path; and the repo’s stream verification stack (GAXI BFMs, Ocelus monitors, CDC FIFOs) attaches everywhere without bespoke protocol work.</w:t>
+      </w:r>
+    </w:p>
+    <w:p>
+      <w:pPr>
+        <w:pStyle w:val="BlockText"/>
+        <w:rPr/>
+      </w:pPr>
+      <w:r>
+        <w:rPr>
+          <w:b/>
+          <w:bCs/>
+        </w:rPr>
+        <w:t>Delta relationship (owner, 2026-10-13):</w:t>
+      </w:r>
+      <w:r>
+        <w:rPr/>
+        <w:t xml:space="preserve"> delta is the AXIS fabric generator and is the fabric; the archived NoC-mesh draft describes the same fabric (the re-home to </w:t>
+      </w:r>
+      <w:r>
+        <w:rPr>
+          <w:rStyle w:val="VerbatimChar"/>
+        </w:rPr>
+        <w:t>fabric-gen-ip/</w:t>
+      </w:r>
+      <w:r>
+        <w:rPr/>
+        <w:t xml:space="preserve"> was organizational). HIVE RTL implements against delta’s AXIS interfaces exactly as the HAS specifies.</w:t>
+      </w:r>
       <w:bookmarkEnd w:id="28"/>
     </w:p>
     <w:p>
@@ -7225,7 +7322,7 @@
         <w:spacing w:before="280" w:after="80"/>
         <w:rPr/>
       </w:pPr>
-      <w:bookmarkStart w:id="29" w:name="__RefHeading___Toc8549_131033504"/>
+      <w:bookmarkStart w:id="29" w:name="__RefHeading___Toc8633_1988885074"/>
       <w:bookmarkStart w:id="30" w:name="machine-organization"/>
       <w:bookmarkEnd w:id="29"/>
       <w:r>
@@ -7332,7 +7429,7 @@
         <w:spacing w:before="280" w:after="80"/>
         <w:rPr/>
       </w:pPr>
-      <w:bookmarkStart w:id="32" w:name="__RefHeading___Toc8551_131033504"/>
+      <w:bookmarkStart w:id="32" w:name="__RefHeading___Toc8635_1988885074"/>
       <w:bookmarkStart w:id="33" w:name="what-is-imported-vs.-what-is-built"/>
       <w:bookmarkEnd w:id="32"/>
       <w:r>
@@ -8070,7 +8167,7 @@
         <w:rPr>
           <w:sz w:val="20"/>
         </w:rPr>
-        <w:t xml:space="preserve"> 2026-10-12</w:t>
+        <w:t xml:space="preserve"> 2026-10-13</w:t>
       </w:r>
     </w:p>
     <w:p>
@@ -8172,7 +8269,7 @@
         <w:spacing w:before="360" w:after="120"/>
         <w:rPr/>
       </w:pPr>
-      <w:bookmarkStart w:id="37" w:name="__RefHeading___Toc8553_131033504"/>
+      <w:bookmarkStart w:id="37" w:name="__RefHeading___Toc8637_1988885074"/>
       <w:bookmarkStart w:id="38" w:name="clocking-and-reset"/>
       <w:bookmarkEnd w:id="37"/>
       <w:r>
@@ -8203,7 +8300,7 @@
         <w:spacing w:before="280" w:after="80"/>
         <w:rPr/>
       </w:pPr>
-      <w:bookmarkStart w:id="39" w:name="__RefHeading___Toc8555_131033504"/>
+      <w:bookmarkStart w:id="39" w:name="__RefHeading___Toc8639_1988885074"/>
       <w:bookmarkStart w:id="40" w:name="clock-domains"/>
       <w:bookmarkEnd w:id="39"/>
       <w:r>
@@ -8971,7 +9068,7 @@
         <w:spacing w:before="280" w:after="80"/>
         <w:rPr/>
       </w:pPr>
-      <w:bookmarkStart w:id="42" w:name="__RefHeading___Toc8557_131033504"/>
+      <w:bookmarkStart w:id="42" w:name="__RefHeading___Toc8641_1988885074"/>
       <w:bookmarkStart w:id="43" w:name="cdc-structure"/>
       <w:bookmarkEnd w:id="42"/>
       <w:r>
@@ -9112,7 +9209,7 @@
         <w:spacing w:before="280" w:after="80"/>
         <w:rPr/>
       </w:pPr>
-      <w:bookmarkStart w:id="45" w:name="__RefHeading___Toc8559_131033504"/>
+      <w:bookmarkStart w:id="45" w:name="__RefHeading___Toc8643_1988885074"/>
       <w:bookmarkStart w:id="46" w:name="reset-architecture"/>
       <w:bookmarkEnd w:id="45"/>
       <w:r>
@@ -10318,7 +10415,7 @@
         <w:spacing w:before="280" w:after="80"/>
         <w:rPr/>
       </w:pPr>
-      <w:bookmarkStart w:id="48" w:name="__RefHeading___Toc8561_131033504"/>
+      <w:bookmarkStart w:id="48" w:name="__RefHeading___Toc8645_1988885074"/>
       <w:bookmarkStart w:id="49" w:name="reset-sequencing"/>
       <w:bookmarkEnd w:id="48"/>
       <w:r>
@@ -10388,7 +10485,7 @@
         <w:spacing w:before="280" w:after="80"/>
         <w:rPr/>
       </w:pPr>
-      <w:bookmarkStart w:id="51" w:name="__RefHeading___Toc8563_131033504"/>
+      <w:bookmarkStart w:id="51" w:name="__RefHeading___Toc8647_1988885074"/>
       <w:bookmarkStart w:id="52" w:name="soft-reset"/>
       <w:bookmarkEnd w:id="51"/>
       <w:r>
@@ -10471,7 +10568,7 @@
         <w:spacing w:before="280" w:after="80"/>
         <w:rPr/>
       </w:pPr>
-      <w:bookmarkStart w:id="53" w:name="__RefHeading___Toc8565_131033504"/>
+      <w:bookmarkStart w:id="53" w:name="__RefHeading___Toc8649_1988885074"/>
       <w:bookmarkStart w:id="54" w:name="clock-gating-optional"/>
       <w:bookmarkEnd w:id="53"/>
       <w:r>
@@ -10725,7 +10822,7 @@
         <w:spacing w:before="360" w:after="120"/>
         <w:rPr/>
       </w:pPr>
-      <w:bookmarkStart w:id="57" w:name="__RefHeading___Toc8567_131033504"/>
+      <w:bookmarkStart w:id="57" w:name="__RefHeading___Toc8651_1988885074"/>
       <w:bookmarkStart w:id="58" w:name="hive_top"/>
       <w:bookmarkEnd w:id="57"/>
       <w:r>
@@ -10781,7 +10878,7 @@
         <w:spacing w:before="280" w:after="80"/>
         <w:rPr/>
       </w:pPr>
-      <w:bookmarkStart w:id="59" w:name="__RefHeading___Toc8569_131033504"/>
+      <w:bookmarkStart w:id="59" w:name="__RefHeading___Toc8653_1988885074"/>
       <w:bookmarkEnd w:id="59"/>
       <w:r>
         <w:rPr>
@@ -11514,7 +11611,7 @@
         <w:spacing w:before="280" w:after="80"/>
         <w:rPr/>
       </w:pPr>
-      <w:bookmarkStart w:id="62" w:name="__RefHeading___Toc8571_131033504"/>
+      <w:bookmarkStart w:id="62" w:name="__RefHeading___Toc8655_1988885074"/>
       <w:bookmarkEnd w:id="62"/>
       <w:r>
         <w:rPr>
@@ -11866,7 +11963,7 @@
         <w:spacing w:before="360" w:after="120"/>
         <w:rPr/>
       </w:pPr>
-      <w:bookmarkStart w:id="64" w:name="__RefHeading___Toc8573_131033504"/>
+      <w:bookmarkStart w:id="64" w:name="__RefHeading___Toc8657_1988885074"/>
       <w:bookmarkStart w:id="65" w:name="hive_c_controller-block-1"/>
       <w:bookmarkEnd w:id="64"/>
       <w:r>
@@ -12026,7 +12123,7 @@
         <w:spacing w:before="280" w:after="80"/>
         <w:rPr/>
       </w:pPr>
-      <w:bookmarkStart w:id="66" w:name="__RefHeading___Toc8575_131033504"/>
+      <w:bookmarkStart w:id="66" w:name="__RefHeading___Toc8659_1988885074"/>
       <w:bookmarkStart w:id="67" w:name="submodules"/>
       <w:bookmarkEnd w:id="66"/>
       <w:r>
@@ -12395,7 +12492,7 @@
         <w:spacing w:before="280" w:after="80"/>
         <w:rPr/>
       </w:pPr>
-      <w:bookmarkStart w:id="68" w:name="__RefHeading___Toc8577_131033504"/>
+      <w:bookmarkStart w:id="68" w:name="__RefHeading___Toc8661_1988885074"/>
       <w:bookmarkStart w:id="69" w:name="interfaces"/>
       <w:bookmarkEnd w:id="68"/>
       <w:r>
@@ -12440,7 +12537,7 @@
         <w:spacing w:before="280" w:after="80"/>
         <w:rPr/>
       </w:pPr>
-      <w:bookmarkStart w:id="71" w:name="__RefHeading___Toc8579_131033504"/>
+      <w:bookmarkStart w:id="71" w:name="__RefHeading___Toc8663_1988885074"/>
       <w:bookmarkStart w:id="72" w:name="decisions-owner-2026-10-13"/>
       <w:bookmarkEnd w:id="71"/>
       <w:r>
@@ -12544,7 +12641,7 @@
         <w:spacing w:before="280" w:after="80"/>
         <w:rPr/>
       </w:pPr>
-      <w:bookmarkStart w:id="73" w:name="__RefHeading___Toc8581_131033504"/>
+      <w:bookmarkStart w:id="73" w:name="__RefHeading___Toc8665_1988885074"/>
       <w:bookmarkStart w:id="74" w:name="open-items"/>
       <w:bookmarkEnd w:id="73"/>
       <w:r>
@@ -12758,7 +12855,7 @@
         <w:spacing w:before="360" w:after="120"/>
         <w:rPr/>
       </w:pPr>
-      <w:bookmarkStart w:id="77" w:name="__RefHeading___Toc8583_131033504"/>
+      <w:bookmarkStart w:id="77" w:name="__RefHeading___Toc8667_1988885074"/>
       <w:bookmarkStart w:id="78" w:name="serv_monitor-block-2"/>
       <w:bookmarkEnd w:id="77"/>
       <w:r>
@@ -12898,7 +12995,7 @@
         <w:spacing w:before="280" w:after="80"/>
         <w:rPr/>
       </w:pPr>
-      <w:bookmarkStart w:id="79" w:name="__RefHeading___Toc8585_131033504"/>
+      <w:bookmarkStart w:id="79" w:name="__RefHeading___Toc8669_1988885074"/>
       <w:bookmarkStart w:id="80" w:name="submodules-1"/>
       <w:bookmarkEnd w:id="79"/>
       <w:r>
@@ -13322,7 +13419,7 @@
         <w:spacing w:before="280" w:after="80"/>
         <w:rPr/>
       </w:pPr>
-      <w:bookmarkStart w:id="81" w:name="__RefHeading___Toc8587_131033504"/>
+      <w:bookmarkStart w:id="81" w:name="__RefHeading___Toc8671_1988885074"/>
       <w:bookmarkStart w:id="82" w:name="interfaces-1"/>
       <w:bookmarkEnd w:id="81"/>
       <w:r>
@@ -13392,7 +13489,7 @@
         <w:spacing w:before="280" w:after="80"/>
         <w:rPr/>
       </w:pPr>
-      <w:bookmarkStart w:id="83" w:name="__RefHeading___Toc8589_131033504"/>
+      <w:bookmarkStart w:id="83" w:name="__RefHeading___Toc8673_1988885074"/>
       <w:bookmarkStart w:id="84" w:name="open-items-1"/>
       <w:bookmarkEnd w:id="83"/>
       <w:r>
@@ -13653,7 +13750,7 @@
         <w:spacing w:before="360" w:after="120"/>
         <w:rPr/>
       </w:pPr>
-      <w:bookmarkStart w:id="87" w:name="__RefHeading___Toc8591_131033504"/>
+      <w:bookmarkStart w:id="87" w:name="__RefHeading___Toc8675_1988885074"/>
       <w:bookmarkStart w:id="88" w:name="control_network-block-3"/>
       <w:bookmarkEnd w:id="87"/>
       <w:r>
@@ -13710,7 +13807,33 @@
         <w:rPr>
           <w:sz w:val="20"/>
         </w:rPr>
-        <w:t xml:space="preserve"> — with the CDC FIFOs below as the only crossing.</w:t>
+        <w:t xml:space="preserve"> — with the CDC FIFOs below as the only crossing. Per the everything-is-a-stream rule (§1.1), all ports are AXIS-shaped: 32-bit data beats with </w:t>
+      </w:r>
+      <w:r>
+        <w:rPr>
+          <w:rStyle w:val="VerbatimChar"/>
+          <w:sz w:val="20"/>
+        </w:rPr>
+        <w:t>tvalid/tready/tlast</w:t>
+      </w:r>
+      <w:r>
+        <w:rPr>
+          <w:sz w:val="20"/>
+        </w:rPr>
+        <w:t xml:space="preserve">, and </w:t>
+      </w:r>
+      <w:r>
+        <w:rPr>
+          <w:rStyle w:val="VerbatimChar"/>
+          <w:sz w:val="20"/>
+        </w:rPr>
+        <w:t>tuser[0]</w:t>
+      </w:r>
+      <w:r>
+        <w:rPr>
+          <w:sz w:val="20"/>
+        </w:rPr>
+        <w:t xml:space="preserve"> carrying the urgent flag — the repo stream BFMs and Ocelus monitors cover this block exactly like the fabric streams.</w:t>
       </w:r>
     </w:p>
     <w:p>
@@ -13786,7 +13909,7 @@
         <w:spacing w:before="280" w:after="80"/>
         <w:rPr/>
       </w:pPr>
-      <w:bookmarkStart w:id="89" w:name="__RefHeading___Toc8593_131033504"/>
+      <w:bookmarkStart w:id="89" w:name="__RefHeading___Toc8677_1988885074"/>
       <w:bookmarkStart w:id="90" w:name="submodules-2"/>
       <w:bookmarkEnd w:id="89"/>
       <w:r>
@@ -13834,7 +13957,33 @@
         <w:rPr>
           <w:sz w:val="20"/>
         </w:rPr>
-        <w:t xml:space="preserve"> Frames are 32-bit (HAS §4.1 contract):</w:t>
+        <w:t xml:space="preserve"> Frames are 32-bit (HAS §4.1 contract), carried as the </w:t>
+      </w:r>
+      <w:r>
+        <w:rPr>
+          <w:rStyle w:val="VerbatimChar"/>
+          <w:sz w:val="20"/>
+        </w:rPr>
+        <w:t>tdata</w:t>
+      </w:r>
+      <w:r>
+        <w:rPr>
+          <w:sz w:val="20"/>
+        </w:rPr>
+        <w:t xml:space="preserve"> payload of an AXIS beat (one frame per beat, </w:t>
+      </w:r>
+      <w:r>
+        <w:rPr>
+          <w:rStyle w:val="VerbatimChar"/>
+          <w:sz w:val="20"/>
+        </w:rPr>
+        <w:t>tlast</w:t>
+      </w:r>
+      <w:r>
+        <w:rPr>
+          <w:sz w:val="20"/>
+        </w:rPr>
+        <w:t xml:space="preserve"> on every beat):</w:t>
       </w:r>
     </w:p>
     <w:p>
@@ -13946,7 +14095,20 @@
         <w:rPr>
           <w:sz w:val="20"/>
         </w:rPr>
-        <w:t xml:space="preserve"> Round-robin over the sixteen uplink FIFOs, non-preemptive per frame, urgent flag honored as next-grant priority (an alert frame marked urgent wins the grant after the current frame). Fairness is structural: equal weights, one frame per grant; starvation is impossible by construction and asserted formally.</w:t>
+        <w:t xml:space="preserve"> Round-robin over the sixteen uplink FIFOs, non-preemptive per frame; </w:t>
+      </w:r>
+      <w:r>
+        <w:rPr>
+          <w:rStyle w:val="VerbatimChar"/>
+          <w:sz w:val="20"/>
+        </w:rPr>
+        <w:t>tuser[0]</w:t>
+      </w:r>
+      <w:r>
+        <w:rPr>
+          <w:sz w:val="20"/>
+        </w:rPr>
+        <w:t xml:space="preserve"> (urgent) is honored as next-grant priority (an alert frame marked urgent wins the grant after the current frame). Fairness is structural: equal weights, one frame per grant; starvation is impossible by construction and asserted formally.</w:t>
       </w:r>
       <w:bookmarkEnd w:id="90"/>
     </w:p>
@@ -13959,7 +14121,7 @@
         <w:spacing w:before="280" w:after="80"/>
         <w:rPr/>
       </w:pPr>
-      <w:bookmarkStart w:id="91" w:name="__RefHeading___Toc8595_131033504"/>
+      <w:bookmarkStart w:id="91" w:name="__RefHeading___Toc8679_1988885074"/>
       <w:bookmarkStart w:id="92" w:name="performance-verification-hooks"/>
       <w:bookmarkEnd w:id="91"/>
       <w:r>
@@ -14071,7 +14233,7 @@
         <w:rPr>
           <w:sz w:val="20"/>
         </w:rPr>
-        <w:t xml:space="preserve"> 2026-10-12</w:t>
+        <w:t xml:space="preserve"> 2026-10-13</w:t>
       </w:r>
     </w:p>
     <w:p>
@@ -14173,7 +14335,7 @@
         <w:spacing w:before="360" w:after="120"/>
         <w:rPr/>
       </w:pPr>
-      <w:bookmarkStart w:id="95" w:name="__RefHeading___Toc8597_131033504"/>
+      <w:bookmarkStart w:id="95" w:name="__RefHeading___Toc8681_1988885074"/>
       <w:bookmarkStart w:id="96" w:name="config_manager-block-4"/>
       <w:bookmarkEnd w:id="95"/>
       <w:r>
@@ -14296,7 +14458,7 @@
         <w:spacing w:before="280" w:after="80"/>
         <w:rPr/>
       </w:pPr>
-      <w:bookmarkStart w:id="97" w:name="__RefHeading___Toc8599_131033504"/>
+      <w:bookmarkStart w:id="97" w:name="__RefHeading___Toc8683_1988885074"/>
       <w:bookmarkStart w:id="98" w:name="submodules-3"/>
       <w:bookmarkEnd w:id="97"/>
       <w:r>
@@ -14601,7 +14763,7 @@
         <w:spacing w:before="280" w:after="80"/>
         <w:rPr/>
       </w:pPr>
-      <w:bookmarkStart w:id="99" w:name="__RefHeading___Toc8601_131033504"/>
+      <w:bookmarkStart w:id="99" w:name="__RefHeading___Toc8685_1988885074"/>
       <w:bookmarkStart w:id="100" w:name="interfaces-2"/>
       <w:bookmarkEnd w:id="99"/>
       <w:r>
@@ -14828,7 +14990,7 @@
         <w:spacing w:before="360" w:after="120"/>
         <w:rPr/>
       </w:pPr>
-      <w:bookmarkStart w:id="103" w:name="__RefHeading___Toc8603_131033504"/>
+      <w:bookmarkStart w:id="103" w:name="__RefHeading___Toc8687_1988885074"/>
       <w:bookmarkStart w:id="104" w:name="common-utilities"/>
       <w:bookmarkEnd w:id="103"/>
       <w:r>
@@ -15959,7 +16121,7 @@
         <w:spacing w:before="360" w:after="120"/>
         <w:rPr/>
       </w:pPr>
-      <w:bookmarkStart w:id="107" w:name="__RefHeading___Toc8605_131033504"/>
+      <w:bookmarkStart w:id="107" w:name="__RefHeading___Toc8689_1988885074"/>
       <w:bookmarkStart w:id="108" w:name="internal-packages-and-wiring"/>
       <w:bookmarkEnd w:id="107"/>
       <w:r>
@@ -15990,7 +16152,7 @@
         <w:spacing w:before="280" w:after="80"/>
         <w:rPr/>
       </w:pPr>
-      <w:bookmarkStart w:id="109" w:name="__RefHeading___Toc8607_131033504"/>
+      <w:bookmarkStart w:id="109" w:name="__RefHeading___Toc8691_1988885074"/>
       <w:bookmarkStart w:id="110" w:name="package-organization"/>
       <w:bookmarkEnd w:id="109"/>
       <w:r>
@@ -16521,7 +16683,7 @@
         <w:spacing w:before="280" w:after="80"/>
         <w:rPr/>
       </w:pPr>
-      <w:bookmarkStart w:id="113" w:name="__RefHeading___Toc8609_131033504"/>
+      <w:bookmarkStart w:id="113" w:name="__RefHeading___Toc8693_1988885074"/>
       <w:bookmarkStart w:id="114" w:name="key-internal-interfaces"/>
       <w:bookmarkEnd w:id="113"/>
       <w:r>
@@ -16654,7 +16816,33 @@
         <w:rPr>
           <w:sz w:val="20"/>
         </w:rPr>
-        <w:t xml:space="preserve"> (§2.4): the 32-bit frame is the only master-to-slave and slave-to-master payload; widening to 64-bit is an open area item if the statistics payload overflows 16 bits regularly.</w:t>
+        <w:t xml:space="preserve"> (§2.4): the 32-bit frame is the only master-to-slave and slave-to-master payload, carried on AXIS handshake signals (</w:t>
+      </w:r>
+      <w:r>
+        <w:rPr>
+          <w:rStyle w:val="VerbatimChar"/>
+          <w:sz w:val="20"/>
+        </w:rPr>
+        <w:t>tvalid/tready/tlast</w:t>
+      </w:r>
+      <w:r>
+        <w:rPr>
+          <w:sz w:val="20"/>
+        </w:rPr>
+        <w:t xml:space="preserve">, </w:t>
+      </w:r>
+      <w:r>
+        <w:rPr>
+          <w:rStyle w:val="VerbatimChar"/>
+          <w:sz w:val="20"/>
+        </w:rPr>
+        <w:t>tuser[0]</w:t>
+      </w:r>
+      <w:r>
+        <w:rPr>
+          <w:sz w:val="20"/>
+        </w:rPr>
+        <w:t xml:space="preserve"> = urgent) per the everything-is-a-stream rule (§1.1); widening to 64-bit is an open area item if the statistics payload overflows 16 bits regularly.</w:t>
       </w:r>
     </w:p>
     <w:p>
@@ -16772,7 +16960,7 @@
         <w:spacing w:before="280" w:after="80"/>
         <w:rPr/>
       </w:pPr>
-      <w:bookmarkStart w:id="115" w:name="__RefHeading___Toc8611_131033504"/>
+      <w:bookmarkStart w:id="115" w:name="__RefHeading___Toc8695_1988885074"/>
       <w:bookmarkStart w:id="116" w:name="wiring-conventions"/>
       <w:bookmarkEnd w:id="115"/>
       <w:r>
@@ -16964,7 +17152,7 @@
         <w:rPr>
           <w:sz w:val="20"/>
         </w:rPr>
-        <w:t xml:space="preserve"> 2026-10-12</w:t>
+        <w:t xml:space="preserve"> 2026-10-13</w:t>
       </w:r>
     </w:p>
     <w:p>
@@ -17066,7 +17254,7 @@
         <w:spacing w:before="360" w:after="120"/>
         <w:rPr/>
       </w:pPr>
-      <w:bookmarkStart w:id="119" w:name="__RefHeading___Toc8613_131033504"/>
+      <w:bookmarkStart w:id="119" w:name="__RefHeading___Toc8697_1988885074"/>
       <w:bookmarkStart w:id="120" w:name="X00b036a2c86c64f5a249a63159c96fdb399e871"/>
       <w:bookmarkEnd w:id="119"/>
       <w:r>
@@ -17459,7 +17647,7 @@
         <w:spacing w:before="360" w:after="120"/>
         <w:rPr/>
       </w:pPr>
-      <w:bookmarkStart w:id="122" w:name="__RefHeading___Toc8615_131033504"/>
+      <w:bookmarkStart w:id="122" w:name="__RefHeading___Toc8699_1988885074"/>
       <w:bookmarkStart w:id="123" w:name="the-monitoring-cycle-step-by-step"/>
       <w:bookmarkEnd w:id="122"/>
       <w:r>
@@ -17502,7 +17690,7 @@
         <w:spacing w:before="280" w:after="80"/>
         <w:rPr/>
       </w:pPr>
-      <w:bookmarkStart w:id="124" w:name="__RefHeading___Toc8617_131033504"/>
+      <w:bookmarkStart w:id="124" w:name="__RefHeading___Toc8701_1988885074"/>
       <w:bookmarkStart w:id="125" w:name="steady-state-every-serv_clk-cycle"/>
       <w:bookmarkEnd w:id="124"/>
       <w:r>
@@ -17645,7 +17833,7 @@
         <w:spacing w:before="280" w:after="80"/>
         <w:rPr/>
       </w:pPr>
-      <w:bookmarkStart w:id="126" w:name="__RefHeading___Toc8619_131033504"/>
+      <w:bookmarkStart w:id="126" w:name="__RefHeading___Toc8703_1988885074"/>
       <w:bookmarkStart w:id="127" w:name="periodic-report"/>
       <w:bookmarkEnd w:id="126"/>
       <w:r>
@@ -17755,7 +17943,7 @@
         <w:spacing w:before="280" w:after="80"/>
         <w:rPr/>
       </w:pPr>
-      <w:bookmarkStart w:id="128" w:name="__RefHeading___Toc8621_131033504"/>
+      <w:bookmarkStart w:id="128" w:name="__RefHeading___Toc8705_1988885074"/>
       <w:bookmarkStart w:id="129" w:name="congestion-alert-urgent-path"/>
       <w:bookmarkEnd w:id="128"/>
       <w:r>
@@ -17859,7 +18047,7 @@
         <w:spacing w:before="280" w:after="80"/>
         <w:rPr/>
       </w:pPr>
-      <w:bookmarkStart w:id="130" w:name="__RefHeading___Toc8623_131033504"/>
+      <w:bookmarkStart w:id="130" w:name="__RefHeading___Toc8707_1988885074"/>
       <w:bookmarkStart w:id="131" w:name="error-path"/>
       <w:bookmarkEnd w:id="130"/>
       <w:r>
@@ -18099,7 +18287,7 @@
         <w:spacing w:before="360" w:after="120"/>
         <w:rPr/>
       </w:pPr>
-      <w:bookmarkStart w:id="134" w:name="__RefHeading___Toc8625_131033504"/>
+      <w:bookmarkStart w:id="134" w:name="__RefHeading___Toc8709_1988885074"/>
       <w:bookmarkStart w:id="135" w:name="X6daf5e5c3fc4fe45ef62af1bdc51434629e2dd2"/>
       <w:bookmarkEnd w:id="134"/>
       <w:r>
@@ -18529,7 +18717,7 @@
         <w:spacing w:before="360" w:after="120"/>
         <w:rPr/>
       </w:pPr>
-      <w:bookmarkStart w:id="137" w:name="__RefHeading___Toc8627_131033504"/>
+      <w:bookmarkStart w:id="137" w:name="__RefHeading___Toc8711_1988885074"/>
       <w:bookmarkStart w:id="138" w:name="reset-and-boot-behavior"/>
       <w:bookmarkEnd w:id="137"/>
       <w:r>
@@ -18922,7 +19110,7 @@
         <w:spacing w:before="360" w:after="120"/>
         <w:rPr/>
       </w:pPr>
-      <w:bookmarkStart w:id="140" w:name="__RefHeading___Toc8629_131033504"/>
+      <w:bookmarkStart w:id="140" w:name="__RefHeading___Toc8713_1988885074"/>
       <w:bookmarkStart w:id="141" w:name="verification-hooks-and-observability"/>
       <w:bookmarkEnd w:id="140"/>
       <w:r>
@@ -18953,7 +19141,7 @@
         <w:spacing w:before="280" w:after="80"/>
         <w:rPr/>
       </w:pPr>
-      <w:bookmarkStart w:id="142" w:name="__RefHeading___Toc8631_131033504"/>
+      <w:bookmarkStart w:id="142" w:name="__RefHeading___Toc8715_1988885074"/>
       <w:bookmarkStart w:id="143" w:name="observation-bus"/>
       <w:bookmarkEnd w:id="142"/>
       <w:r>
@@ -19036,7 +19224,7 @@
         <w:spacing w:before="280" w:after="80"/>
         <w:rPr/>
       </w:pPr>
-      <w:bookmarkStart w:id="144" w:name="__RefHeading___Toc8633_131033504"/>
+      <w:bookmarkStart w:id="144" w:name="__RefHeading___Toc8717_1988885074"/>
       <w:bookmarkEnd w:id="144"/>
       <w:r>
         <w:rPr>
@@ -19567,7 +19755,7 @@
         <w:spacing w:before="280" w:after="80"/>
         <w:rPr/>
       </w:pPr>
-      <w:bookmarkStart w:id="147" w:name="__RefHeading___Toc8635_131033504"/>
+      <w:bookmarkStart w:id="147" w:name="__RefHeading___Toc8719_1988885074"/>
       <w:bookmarkEnd w:id="147"/>
       <w:r>
         <w:rPr>
@@ -19744,7 +19932,7 @@
         <w:spacing w:before="280" w:after="80"/>
         <w:rPr/>
       </w:pPr>
-      <w:bookmarkStart w:id="148" w:name="__RefHeading___Toc8637_131033504"/>
+      <w:bookmarkStart w:id="148" w:name="__RefHeading___Toc8721_1988885074"/>
       <w:bookmarkStart w:id="149" w:name="Xfb7cade6dd609aff7b175f7ab1bf7b357dd0733"/>
       <w:bookmarkEnd w:id="148"/>
       <w:r>
@@ -19998,7 +20186,7 @@
         <w:spacing w:before="360" w:after="120"/>
         <w:rPr/>
       </w:pPr>
-      <w:bookmarkStart w:id="152" w:name="__RefHeading___Toc8639_131033504"/>
+      <w:bookmarkStart w:id="152" w:name="__RefHeading___Toc8723_1988885074"/>
       <w:bookmarkStart w:id="153" w:name="parameters-defines-and-filelists"/>
       <w:bookmarkEnd w:id="152"/>
       <w:r>
@@ -20029,7 +20217,7 @@
         <w:spacing w:before="280" w:after="80"/>
         <w:rPr/>
       </w:pPr>
-      <w:bookmarkStart w:id="154" w:name="__RefHeading___Toc8641_131033504"/>
+      <w:bookmarkStart w:id="154" w:name="__RefHeading___Toc8725_1988885074"/>
       <w:bookmarkStart w:id="155" w:name="Xf910f34c846650240425eda0c67fc83088625b9"/>
       <w:bookmarkEnd w:id="154"/>
       <w:r>
@@ -20674,7 +20862,7 @@
         <w:spacing w:before="280" w:after="80"/>
         <w:rPr/>
       </w:pPr>
-      <w:bookmarkStart w:id="156" w:name="__RefHeading___Toc8643_131033504"/>
+      <w:bookmarkStart w:id="156" w:name="__RefHeading___Toc8727_1988885074"/>
       <w:bookmarkStart w:id="157" w:name="software-knobs-swcommonhive_config.h"/>
       <w:bookmarkEnd w:id="156"/>
       <w:r>
@@ -20829,7 +21017,7 @@
         <w:spacing w:before="280" w:after="80"/>
         <w:rPr/>
       </w:pPr>
-      <w:bookmarkStart w:id="158" w:name="__RefHeading___Toc8645_131033504"/>
+      <w:bookmarkStart w:id="158" w:name="__RefHeading___Toc8729_1988885074"/>
       <w:bookmarkStart w:id="159" w:name="planned-filelist-layout"/>
       <w:bookmarkEnd w:id="158"/>
       <w:r>
@@ -21036,7 +21224,7 @@
         <w:spacing w:before="280" w:after="80"/>
         <w:rPr/>
       </w:pPr>
-      <w:bookmarkStart w:id="161" w:name="__RefHeading___Toc8647_131033504"/>
+      <w:bookmarkStart w:id="161" w:name="__RefHeading___Toc8731_1988885074"/>
       <w:bookmarkStart w:id="162" w:name="scaling-knobs"/>
       <w:bookmarkEnd w:id="161"/>
       <w:r>
@@ -21309,7 +21497,7 @@
         <w:spacing w:before="360" w:after="120"/>
         <w:rPr/>
       </w:pPr>
-      <w:bookmarkStart w:id="165" w:name="__RefHeading___Toc8649_131033504"/>
+      <w:bookmarkStart w:id="165" w:name="__RefHeading___Toc8733_1988885074"/>
       <w:bookmarkStart w:id="166" w:name="Xe82272c7013aa6ac8b126343bc1a7983c5b4570"/>
       <w:bookmarkEnd w:id="165"/>
       <w:r>
@@ -21463,7 +21651,7 @@
         <w:spacing w:before="280" w:after="80"/>
         <w:rPr/>
       </w:pPr>
-      <w:bookmarkStart w:id="167" w:name="__RefHeading___Toc8651_131033504"/>
+      <w:bookmarkStart w:id="167" w:name="__RefHeading___Toc8735_1988885074"/>
       <w:bookmarkStart w:id="168" w:name="document-organization"/>
       <w:bookmarkEnd w:id="167"/>
       <w:r>
@@ -21511,7 +21699,7 @@
         <w:spacing w:before="200" w:after="80"/>
         <w:rPr/>
       </w:pPr>
-      <w:bookmarkStart w:id="169" w:name="__RefHeading___Toc8653_131033504"/>
+      <w:bookmarkStart w:id="169" w:name="__RefHeading___Toc8737_1988885074"/>
       <w:bookmarkStart w:id="170" w:name="front-matter"/>
       <w:bookmarkEnd w:id="169"/>
       <w:r>
@@ -21559,7 +21747,7 @@
         <w:spacing w:before="200" w:after="80"/>
         <w:rPr/>
       </w:pPr>
-      <w:bookmarkStart w:id="172" w:name="__RefHeading___Toc8655_131033504"/>
+      <w:bookmarkStart w:id="172" w:name="__RefHeading___Toc8739_1988885074"/>
       <w:bookmarkStart w:id="173" w:name="chapter-1-introduction"/>
       <w:bookmarkEnd w:id="172"/>
       <w:r>
@@ -21607,7 +21795,7 @@
         <w:spacing w:before="200" w:after="80"/>
         <w:rPr/>
       </w:pPr>
-      <w:bookmarkStart w:id="175" w:name="__RefHeading___Toc8657_131033504"/>
+      <w:bookmarkStart w:id="175" w:name="__RefHeading___Toc8741_1988885074"/>
       <w:bookmarkStart w:id="176" w:name="chapter-2-system-overview"/>
       <w:bookmarkEnd w:id="175"/>
       <w:r>
@@ -21655,7 +21843,7 @@
         <w:spacing w:before="200" w:after="80"/>
         <w:rPr/>
       </w:pPr>
-      <w:bookmarkStart w:id="178" w:name="__RefHeading___Toc8659_131033504"/>
+      <w:bookmarkStart w:id="178" w:name="__RefHeading___Toc8743_1988885074"/>
       <w:bookmarkStart w:id="179" w:name="chapter-3-subsystem-architecture"/>
       <w:bookmarkEnd w:id="178"/>
       <w:r>
@@ -21706,7 +21894,7 @@
         <w:spacing w:before="200" w:after="80"/>
         <w:rPr/>
       </w:pPr>
-      <w:bookmarkStart w:id="180" w:name="__RefHeading___Toc8661_131033504"/>
+      <w:bookmarkStart w:id="180" w:name="__RefHeading___Toc8745_1988885074"/>
       <w:bookmarkStart w:id="181" w:name="chapter-4-interfaces"/>
       <w:bookmarkEnd w:id="180"/>
       <w:r>
@@ -21790,7 +21978,7 @@
         <w:spacing w:before="200" w:after="80"/>
         <w:rPr/>
       </w:pPr>
-      <w:bookmarkStart w:id="183" w:name="__RefHeading___Toc8663_131033504"/>
+      <w:bookmarkStart w:id="183" w:name="__RefHeading___Toc8747_1988885074"/>
       <w:bookmarkStart w:id="184" w:name="chapter-5-programming-model"/>
       <w:bookmarkEnd w:id="183"/>
       <w:r>
@@ -21892,7 +22080,7 @@
         <w:spacing w:before="200" w:after="80"/>
         <w:rPr/>
       </w:pPr>
-      <w:bookmarkStart w:id="186" w:name="__RefHeading___Toc8665_131033504"/>
+      <w:bookmarkStart w:id="186" w:name="__RefHeading___Toc8749_1988885074"/>
       <w:bookmarkStart w:id="187" w:name="chapter-6-performance"/>
       <w:bookmarkEnd w:id="186"/>
       <w:r>
@@ -21940,7 +22128,7 @@
         <w:spacing w:before="200" w:after="80"/>
         <w:rPr/>
       </w:pPr>
-      <w:bookmarkStart w:id="189" w:name="__RefHeading___Toc8667_131033504"/>
+      <w:bookmarkStart w:id="189" w:name="__RefHeading___Toc8751_1988885074"/>
       <w:bookmarkStart w:id="190" w:name="chapter-7-integration-and-verification"/>
       <w:bookmarkEnd w:id="189"/>
       <w:r>
@@ -22054,7 +22242,7 @@
         <w:spacing w:before="280" w:after="80"/>
         <w:rPr/>
       </w:pPr>
-      <w:bookmarkStart w:id="193" w:name="__RefHeading___Toc8669_131033504"/>
+      <w:bookmarkStart w:id="193" w:name="__RefHeading___Toc8753_1988885074"/>
       <w:bookmarkStart w:id="194" w:name="related-documentation"/>
       <w:bookmarkEnd w:id="193"/>
       <w:r>
@@ -22414,7 +22602,7 @@
         <w:spacing w:before="360" w:after="120"/>
         <w:rPr/>
       </w:pPr>
-      <w:bookmarkStart w:id="197" w:name="__RefHeading___Toc8671_131033504"/>
+      <w:bookmarkStart w:id="197" w:name="__RefHeading___Toc8755_1988885074"/>
       <w:bookmarkStart w:id="198" w:name="product-requirements-document-prd"/>
       <w:bookmarkEnd w:id="197"/>
       <w:r>
@@ -22445,7 +22633,7 @@
         <w:spacing w:before="280" w:after="80"/>
         <w:rPr/>
       </w:pPr>
-      <w:bookmarkStart w:id="199" w:name="__RefHeading___Toc8673_131033504"/>
+      <w:bookmarkStart w:id="199" w:name="__RefHeading___Toc8757_1988885074"/>
       <w:bookmarkStart w:id="200" w:name="Xf220e2009d15f5960cb96a5ee8e27e8e4f14bc0"/>
       <w:bookmarkEnd w:id="199"/>
       <w:r>
@@ -22622,7 +22810,7 @@
         <w:spacing w:before="280" w:after="80"/>
         <w:rPr/>
       </w:pPr>
-      <w:bookmarkStart w:id="202" w:name="__RefHeading___Toc8675_131033504"/>
+      <w:bookmarkStart w:id="202" w:name="__RefHeading___Toc8759_1988885074"/>
       <w:bookmarkStart w:id="203" w:name="executive-summary"/>
       <w:bookmarkEnd w:id="202"/>
       <w:r>
@@ -22662,7 +22850,7 @@
         <w:spacing w:before="200" w:after="80"/>
         <w:rPr/>
       </w:pPr>
-      <w:bookmarkStart w:id="204" w:name="__RefHeading___Toc8677_131033504"/>
+      <w:bookmarkStart w:id="204" w:name="__RefHeading___Toc8761_1988885074"/>
       <w:bookmarkStart w:id="205" w:name="quick-stats"/>
       <w:bookmarkEnd w:id="204"/>
       <w:r>
@@ -22796,7 +22984,7 @@
         <w:spacing w:before="200" w:after="80"/>
         <w:rPr/>
       </w:pPr>
-      <w:bookmarkStart w:id="206" w:name="__RefHeading___Toc8679_131033504"/>
+      <w:bookmarkStart w:id="206" w:name="__RefHeading___Toc8763_1988885074"/>
       <w:bookmarkStart w:id="207" w:name="subsystem-goals"/>
       <w:bookmarkEnd w:id="206"/>
       <w:r>
@@ -22955,7 +23143,7 @@
         <w:spacing w:before="280" w:after="80"/>
         <w:rPr/>
       </w:pPr>
-      <w:bookmarkStart w:id="210" w:name="__RefHeading___Toc8681_131033504"/>
+      <w:bookmarkStart w:id="210" w:name="__RefHeading___Toc8765_1988885074"/>
       <w:bookmarkStart w:id="211" w:name="documentation-structure"/>
       <w:bookmarkEnd w:id="210"/>
       <w:r>
@@ -23003,7 +23191,7 @@
         <w:spacing w:before="200" w:after="80"/>
         <w:rPr/>
       </w:pPr>
-      <w:bookmarkStart w:id="212" w:name="__RefHeading___Toc8683_131033504"/>
+      <w:bookmarkStart w:id="212" w:name="__RefHeading___Toc8767_1988885074"/>
       <w:bookmarkStart w:id="213" w:name="Xb10c81c1c14c4cf3e04d867deb570be1f5100d8"/>
       <w:bookmarkEnd w:id="212"/>
       <w:r>
@@ -23098,7 +23286,7 @@
         <w:spacing w:before="200" w:after="80"/>
         <w:rPr/>
       </w:pPr>
-      <w:bookmarkStart w:id="215" w:name="__RefHeading___Toc8685_131033504"/>
+      <w:bookmarkStart w:id="215" w:name="__RefHeading___Toc8769_1988885074"/>
       <w:bookmarkStart w:id="216" w:name="X202b40cfd4087fafb9c931521382db441edebbf"/>
       <w:bookmarkEnd w:id="215"/>
       <w:r>
@@ -23193,7 +23381,7 @@
         <w:spacing w:before="200" w:after="80"/>
         <w:rPr/>
       </w:pPr>
-      <w:bookmarkStart w:id="218" w:name="__RefHeading___Toc8687_131033504"/>
+      <w:bookmarkStart w:id="218" w:name="__RefHeading___Toc8771_1988885074"/>
       <w:bookmarkStart w:id="219" w:name="other-documentation"/>
       <w:bookmarkEnd w:id="218"/>
       <w:r>
@@ -23402,7 +23590,7 @@
         <w:spacing w:before="280" w:after="80"/>
         <w:rPr/>
       </w:pPr>
-      <w:bookmarkStart w:id="222" w:name="__RefHeading___Toc8689_131033504"/>
+      <w:bookmarkStart w:id="222" w:name="__RefHeading___Toc8773_1988885074"/>
       <w:bookmarkStart w:id="223" w:name="architecture-overview"/>
       <w:bookmarkEnd w:id="222"/>
       <w:r>
@@ -23430,7 +23618,7 @@
         <w:spacing w:before="200" w:after="80"/>
         <w:rPr/>
       </w:pPr>
-      <w:bookmarkStart w:id="224" w:name="__RefHeading___Toc8691_131033504"/>
+      <w:bookmarkStart w:id="224" w:name="__RefHeading___Toc8775_1988885074"/>
       <w:bookmarkStart w:id="225" w:name="top-level-block-diagram"/>
       <w:bookmarkEnd w:id="224"/>
       <w:r>
@@ -23780,7 +23968,7 @@
         <w:spacing w:before="200" w:after="80"/>
         <w:rPr/>
       </w:pPr>
-      <w:bookmarkStart w:id="226" w:name="__RefHeading___Toc8693_131033504"/>
+      <w:bookmarkStart w:id="226" w:name="__RefHeading___Toc8777_1988885074"/>
       <w:bookmarkStart w:id="227" w:name="resource-budget-nexysa7-100t"/>
       <w:bookmarkEnd w:id="226"/>
       <w:r>
@@ -25961,7 +26149,7 @@
         <w:spacing w:before="280" w:after="80"/>
         <w:rPr/>
       </w:pPr>
-      <w:bookmarkStart w:id="230" w:name="__RefHeading___Toc8695_131033504"/>
+      <w:bookmarkStart w:id="230" w:name="__RefHeading___Toc8779_1988885074"/>
       <w:bookmarkStart w:id="231" w:name="key-features"/>
       <w:bookmarkEnd w:id="230"/>
       <w:r>
@@ -25989,7 +26177,7 @@
         <w:spacing w:before="200" w:after="80"/>
         <w:rPr/>
       </w:pPr>
-      <w:bookmarkStart w:id="232" w:name="__RefHeading___Toc8697_131033504"/>
+      <w:bookmarkStart w:id="232" w:name="__RefHeading___Toc8781_1988885074"/>
       <w:bookmarkEnd w:id="232"/>
       <w:r>
         <w:rPr>
@@ -26536,7 +26724,7 @@
         <w:spacing w:before="200" w:after="80"/>
         <w:rPr/>
       </w:pPr>
-      <w:bookmarkStart w:id="234" w:name="__RefHeading___Toc8699_131033504"/>
+      <w:bookmarkStart w:id="234" w:name="__RefHeading___Toc8783_1988885074"/>
       <w:bookmarkEnd w:id="234"/>
       <w:r>
         <w:rPr>
@@ -27177,7 +27365,7 @@
         <w:spacing w:before="200" w:after="80"/>
         <w:rPr/>
       </w:pPr>
-      <w:bookmarkStart w:id="235" w:name="__RefHeading___Toc8701_131033504"/>
+      <w:bookmarkStart w:id="235" w:name="__RefHeading___Toc8785_1988885074"/>
       <w:bookmarkEnd w:id="235"/>
       <w:r>
         <w:rPr>
@@ -27722,7 +27910,7 @@
         <w:spacing w:before="200" w:after="80"/>
         <w:rPr/>
       </w:pPr>
-      <w:bookmarkStart w:id="236" w:name="__RefHeading___Toc8703_131033504"/>
+      <w:bookmarkStart w:id="236" w:name="__RefHeading___Toc8787_1988885074"/>
       <w:bookmarkEnd w:id="236"/>
       <w:r>
         <w:rPr>
@@ -28333,7 +28521,7 @@
         <w:spacing w:before="280" w:after="80"/>
         <w:rPr/>
       </w:pPr>
-      <w:bookmarkStart w:id="238" w:name="__RefHeading___Toc8705_131033504"/>
+      <w:bookmarkStart w:id="238" w:name="__RefHeading___Toc8789_1988885074"/>
       <w:bookmarkStart w:id="239" w:name="interfaces-3"/>
       <w:bookmarkEnd w:id="238"/>
       <w:r>
@@ -28361,7 +28549,7 @@
         <w:spacing w:before="200" w:after="80"/>
         <w:rPr/>
       </w:pPr>
-      <w:bookmarkStart w:id="240" w:name="__RefHeading___Toc8707_131033504"/>
+      <w:bookmarkStart w:id="240" w:name="__RefHeading___Toc8791_1988885074"/>
       <w:bookmarkStart w:id="241" w:name="external-interfaces"/>
       <w:bookmarkEnd w:id="240"/>
       <w:r>
@@ -29239,7 +29427,7 @@
         <w:spacing w:before="200" w:after="80"/>
         <w:rPr/>
       </w:pPr>
-      <w:bookmarkStart w:id="242" w:name="__RefHeading___Toc8709_131033504"/>
+      <w:bookmarkStart w:id="242" w:name="__RefHeading___Toc8793_1988885074"/>
       <w:bookmarkStart w:id="243" w:name="virtual-tile-mapping"/>
       <w:bookmarkEnd w:id="242"/>
       <w:r>
@@ -29665,7 +29853,7 @@
         <w:spacing w:before="280" w:after="80"/>
         <w:rPr/>
       </w:pPr>
-      <w:bookmarkStart w:id="246" w:name="__RefHeading___Toc8711_131033504"/>
+      <w:bookmarkStart w:id="246" w:name="__RefHeading___Toc8795_1988885074"/>
       <w:bookmarkStart w:id="247" w:name="use-cases"/>
       <w:bookmarkEnd w:id="246"/>
       <w:r>
@@ -29693,7 +29881,7 @@
         <w:spacing w:before="200" w:after="80"/>
         <w:rPr/>
       </w:pPr>
-      <w:bookmarkStart w:id="248" w:name="__RefHeading___Toc8713_131033504"/>
+      <w:bookmarkStart w:id="248" w:name="__RefHeading___Toc8797_1988885074"/>
       <w:bookmarkStart w:id="249" w:name="descriptor-scheduling"/>
       <w:bookmarkEnd w:id="248"/>
       <w:r>
@@ -29762,7 +29950,7 @@
         <w:spacing w:before="200" w:after="80"/>
         <w:rPr/>
       </w:pPr>
-      <w:bookmarkStart w:id="250" w:name="__RefHeading___Toc8715_131033504"/>
+      <w:bookmarkStart w:id="250" w:name="__RefHeading___Toc8799_1988885074"/>
       <w:bookmarkStart w:id="251" w:name="congestion-management"/>
       <w:bookmarkEnd w:id="250"/>
       <w:r>
@@ -29831,7 +30019,7 @@
         <w:spacing w:before="200" w:after="80"/>
         <w:rPr/>
       </w:pPr>
-      <w:bookmarkStart w:id="252" w:name="__RefHeading___Toc8717_131033504"/>
+      <w:bookmarkStart w:id="252" w:name="__RefHeading___Toc8801_1988885074"/>
       <w:bookmarkStart w:id="253" w:name="network-reconfiguration-1"/>
       <w:bookmarkEnd w:id="252"/>
       <w:r>
@@ -29967,7 +30155,7 @@
         <w:spacing w:before="280" w:after="80"/>
         <w:rPr/>
       </w:pPr>
-      <w:bookmarkStart w:id="256" w:name="__RefHeading___Toc8719_131033504"/>
+      <w:bookmarkStart w:id="256" w:name="__RefHeading___Toc8803_1988885074"/>
       <w:bookmarkStart w:id="257" w:name="test-coverage"/>
       <w:bookmarkEnd w:id="256"/>
       <w:r>
@@ -29995,7 +30183,7 @@
         <w:spacing w:before="200" w:after="80"/>
         <w:rPr/>
       </w:pPr>
-      <w:bookmarkStart w:id="258" w:name="__RefHeading___Toc8721_131033504"/>
+      <w:bookmarkStart w:id="258" w:name="__RefHeading___Toc8805_1988885074"/>
       <w:bookmarkStart w:id="259" w:name="current-status"/>
       <w:bookmarkEnd w:id="258"/>
       <w:r>
@@ -30725,7 +30913,7 @@
         <w:spacing w:before="280" w:after="80"/>
         <w:rPr/>
       </w:pPr>
-      <w:bookmarkStart w:id="262" w:name="__RefHeading___Toc8723_131033504"/>
+      <w:bookmarkStart w:id="262" w:name="__RefHeading___Toc8807_1988885074"/>
       <w:bookmarkStart w:id="263" w:name="performance-targets"/>
       <w:bookmarkEnd w:id="262"/>
       <w:r>
@@ -30753,7 +30941,7 @@
         <w:spacing w:before="200" w:after="80"/>
         <w:rPr/>
       </w:pPr>
-      <w:bookmarkStart w:id="264" w:name="__RefHeading___Toc8725_131033504"/>
+      <w:bookmarkStart w:id="264" w:name="__RefHeading___Toc8809_1988885074"/>
       <w:bookmarkStart w:id="265" w:name="latency-targets"/>
       <w:bookmarkEnd w:id="264"/>
       <w:r>
@@ -30866,7 +31054,7 @@
         <w:spacing w:before="200" w:after="80"/>
         <w:rPr/>
       </w:pPr>
-      <w:bookmarkStart w:id="266" w:name="__RefHeading___Toc8727_131033504"/>
+      <w:bookmarkStart w:id="266" w:name="__RefHeading___Toc8811_1988885074"/>
       <w:bookmarkStart w:id="267" w:name="monitoring-overhead"/>
       <w:bookmarkEnd w:id="266"/>
       <w:r>
@@ -31058,7 +31246,7 @@
         <w:spacing w:before="280" w:after="80"/>
         <w:rPr/>
       </w:pPr>
-      <w:bookmarkStart w:id="270" w:name="__RefHeading___Toc8729_131033504"/>
+      <w:bookmarkStart w:id="270" w:name="__RefHeading___Toc8813_1988885074"/>
       <w:bookmarkStart w:id="271" w:name="integration-guidelines"/>
       <w:bookmarkEnd w:id="270"/>
       <w:r>
@@ -31086,7 +31274,7 @@
         <w:spacing w:before="200" w:after="80"/>
         <w:rPr/>
       </w:pPr>
-      <w:bookmarkStart w:id="272" w:name="__RefHeading___Toc8731_131033504"/>
+      <w:bookmarkStart w:id="272" w:name="__RefHeading___Toc8815_1988885074"/>
       <w:bookmarkStart w:id="273" w:name="hive-rapids-delta-integration"/>
       <w:bookmarkEnd w:id="272"/>
       <w:r>
@@ -31771,7 +31959,7 @@
         <w:spacing w:before="280" w:after="80"/>
         <w:rPr/>
       </w:pPr>
-      <w:bookmarkStart w:id="276" w:name="__RefHeading___Toc8733_131033504"/>
+      <w:bookmarkStart w:id="276" w:name="__RefHeading___Toc8817_1988885074"/>
       <w:bookmarkStart w:id="277" w:name="development-status"/>
       <w:bookmarkEnd w:id="276"/>
       <w:r>
@@ -31799,7 +31987,7 @@
         <w:spacing w:before="200" w:after="80"/>
         <w:rPr/>
       </w:pPr>
-      <w:bookmarkStart w:id="278" w:name="__RefHeading___Toc8735_131033504"/>
+      <w:bookmarkStart w:id="278" w:name="__RefHeading___Toc8819_1988885074"/>
       <w:bookmarkStart w:id="279" w:name="current-phase"/>
       <w:bookmarkEnd w:id="278"/>
       <w:r>
@@ -31910,7 +32098,7 @@
         <w:spacing w:before="200" w:after="80"/>
         <w:rPr/>
       </w:pPr>
-      <w:bookmarkStart w:id="280" w:name="__RefHeading___Toc8737_131033504"/>
+      <w:bookmarkStart w:id="280" w:name="__RefHeading___Toc8821_1988885074"/>
       <w:bookmarkStart w:id="281" w:name="roadmap"/>
       <w:bookmarkEnd w:id="280"/>
       <w:r>
@@ -32046,7 +32234,7 @@
         <w:spacing w:before="280" w:after="80"/>
         <w:rPr/>
       </w:pPr>
-      <w:bookmarkStart w:id="284" w:name="__RefHeading___Toc8739_131033504"/>
+      <w:bookmarkStart w:id="284" w:name="__RefHeading___Toc8823_1988885074"/>
       <w:bookmarkStart w:id="285" w:name="educational-value"/>
       <w:bookmarkEnd w:id="284"/>
       <w:r>
@@ -32172,7 +32360,7 @@
         <w:spacing w:before="280" w:after="80"/>
         <w:rPr/>
       </w:pPr>
-      <w:bookmarkStart w:id="287" w:name="__RefHeading___Toc8741_131033504"/>
+      <w:bookmarkStart w:id="287" w:name="__RefHeading___Toc8825_1988885074"/>
       <w:bookmarkStart w:id="288" w:name="documentation-generation"/>
       <w:bookmarkEnd w:id="287"/>
       <w:r>
@@ -32200,7 +32388,7 @@
         <w:spacing w:before="200" w:after="80"/>
         <w:rPr/>
       </w:pPr>
-      <w:bookmarkStart w:id="289" w:name="__RefHeading___Toc8743_131033504"/>
+      <w:bookmarkStart w:id="289" w:name="__RefHeading___Toc8827_1988885074"/>
       <w:bookmarkStart w:id="290" w:name="X5e4e18a2b65fd936e2bfbafe8717c1cad1f3d3e"/>
       <w:bookmarkEnd w:id="289"/>
       <w:r>
@@ -32487,7 +32675,7 @@
         <w:spacing w:before="280" w:after="80"/>
         <w:rPr/>
       </w:pPr>
-      <w:bookmarkStart w:id="293" w:name="__RefHeading___Toc8745_131033504"/>
+      <w:bookmarkStart w:id="293" w:name="__RefHeading___Toc8829_1988885074"/>
       <w:bookmarkStart w:id="294" w:name="references-1"/>
       <w:bookmarkEnd w:id="293"/>
       <w:r>
@@ -32515,7 +32703,7 @@
         <w:spacing w:before="200" w:after="80"/>
         <w:rPr/>
       </w:pPr>
-      <w:bookmarkStart w:id="295" w:name="__RefHeading___Toc8747_131033504"/>
+      <w:bookmarkStart w:id="295" w:name="__RefHeading___Toc8831_1988885074"/>
       <w:bookmarkStart w:id="296" w:name="internal-documentation"/>
       <w:bookmarkEnd w:id="295"/>
       <w:r>
@@ -32674,7 +32862,7 @@
         <w:spacing w:before="200" w:after="80"/>
         <w:rPr/>
       </w:pPr>
-      <w:bookmarkStart w:id="297" w:name="__RefHeading___Toc8749_131033504"/>
+      <w:bookmarkStart w:id="297" w:name="__RefHeading___Toc8833_1988885074"/>
       <w:bookmarkStart w:id="298" w:name="related-subsystems"/>
       <w:bookmarkEnd w:id="297"/>
       <w:r>
@@ -32755,7 +32943,7 @@
       </w:r>
       <w:r>
         <w:rPr/>
-        <w:t xml:space="preserve"> - 4×4 mesh NoC</w:t>
+        <w:t xml:space="preserve"> - AXIS fabric generator (the HIVE fabric; owner: same fabric as the archived NoC draft)</w:t>
       </w:r>
     </w:p>
     <w:p>
@@ -32827,7 +33015,7 @@
         <w:spacing w:before="200" w:after="80"/>
         <w:rPr/>
       </w:pPr>
-      <w:bookmarkStart w:id="299" w:name="__RefHeading___Toc8751_131033504"/>
+      <w:bookmarkStart w:id="299" w:name="__RefHeading___Toc8835_1988885074"/>
       <w:bookmarkStart w:id="300" w:name="external-references"/>
       <w:bookmarkEnd w:id="299"/>
       <w:r>
@@ -33130,7 +33318,7 @@
         <w:spacing w:before="280" w:after="80"/>
         <w:rPr/>
       </w:pPr>
-      <w:bookmarkStart w:id="303" w:name="__RefHeading___Toc8753_131033504"/>
+      <w:bookmarkStart w:id="303" w:name="__RefHeading___Toc8837_1988885074"/>
       <w:bookmarkStart w:id="304" w:name="navigation"/>
       <w:bookmarkEnd w:id="303"/>
       <w:r>
@@ -33418,7 +33606,7 @@
         <w:spacing w:before="360" w:after="120"/>
         <w:rPr/>
       </w:pPr>
-      <w:bookmarkStart w:id="307" w:name="__RefHeading___Toc8755_131033504"/>
+      <w:bookmarkStart w:id="307" w:name="__RefHeading___Toc8839_1988885074"/>
       <w:bookmarkStart w:id="308" w:name="rapids-beats-architecture-mas"/>
       <w:bookmarkEnd w:id="307"/>
       <w:r>
@@ -33558,7 +33746,7 @@
         <w:spacing w:before="280" w:after="80"/>
         <w:rPr/>
       </w:pPr>
-      <w:bookmarkStart w:id="309" w:name="__RefHeading___Toc8757_131033504"/>
+      <w:bookmarkStart w:id="309" w:name="__RefHeading___Toc8841_1988885074"/>
       <w:bookmarkStart w:id="310" w:name="document-organization-1"/>
       <w:bookmarkEnd w:id="309"/>
       <w:r>
@@ -33606,7 +33794,7 @@
         <w:spacing w:before="200" w:after="80"/>
         <w:rPr/>
       </w:pPr>
-      <w:bookmarkStart w:id="311" w:name="__RefHeading___Toc8759_131033504"/>
+      <w:bookmarkStart w:id="311" w:name="__RefHeading___Toc8843_1988885074"/>
       <w:bookmarkStart w:id="312" w:name="front-matter-1"/>
       <w:bookmarkEnd w:id="311"/>
       <w:r>
@@ -33654,7 +33842,7 @@
         <w:spacing w:before="200" w:after="80"/>
         <w:rPr/>
       </w:pPr>
-      <w:bookmarkStart w:id="314" w:name="__RefHeading___Toc8761_131033504"/>
+      <w:bookmarkStart w:id="314" w:name="__RefHeading___Toc8845_1988885074"/>
       <w:bookmarkStart w:id="315" w:name="chapter-1-overview"/>
       <w:bookmarkEnd w:id="314"/>
       <w:r>
@@ -33738,7 +33926,7 @@
         <w:spacing w:before="200" w:after="80"/>
         <w:rPr/>
       </w:pPr>
-      <w:bookmarkStart w:id="317" w:name="__RefHeading___Toc8763_131033504"/>
+      <w:bookmarkStart w:id="317" w:name="__RefHeading___Toc8847_1988885074"/>
       <w:bookmarkStart w:id="318" w:name="chapter-2-fub-functional-unit-blocks"/>
       <w:bookmarkEnd w:id="317"/>
       <w:r>
@@ -33949,7 +34137,7 @@
         <w:spacing w:before="200" w:after="80"/>
         <w:rPr/>
       </w:pPr>
-      <w:bookmarkStart w:id="319" w:name="__RefHeading___Toc8765_131033504"/>
+      <w:bookmarkStart w:id="319" w:name="__RefHeading___Toc8849_1988885074"/>
       <w:bookmarkStart w:id="320" w:name="chapter-3-macro-integration-blocks"/>
       <w:bookmarkEnd w:id="319"/>
       <w:r>
@@ -34202,7 +34390,7 @@
         <w:spacing w:before="200" w:after="80"/>
         <w:rPr/>
       </w:pPr>
-      <w:bookmarkStart w:id="321" w:name="__RefHeading___Toc8767_131033504"/>
+      <w:bookmarkStart w:id="321" w:name="__RefHeading___Toc8851_1988885074"/>
       <w:bookmarkStart w:id="322" w:name="chapter-4-interfaces-1"/>
       <w:bookmarkEnd w:id="321"/>
       <w:r>
@@ -34370,7 +34558,7 @@
         <w:spacing w:before="280" w:after="80"/>
         <w:rPr/>
       </w:pPr>
-      <w:bookmarkStart w:id="325" w:name="__RefHeading___Toc8769_131033504"/>
+      <w:bookmarkStart w:id="325" w:name="__RefHeading___Toc8853_1988885074"/>
       <w:bookmarkStart w:id="326" w:name="quick-reference"/>
       <w:bookmarkEnd w:id="325"/>
       <w:r>
@@ -34398,7 +34586,7 @@
         <w:spacing w:before="200" w:after="80"/>
         <w:rPr/>
       </w:pPr>
-      <w:bookmarkStart w:id="327" w:name="__RefHeading___Toc8771_131033504"/>
+      <w:bookmarkStart w:id="327" w:name="__RefHeading___Toc8855_1988885074"/>
       <w:bookmarkEnd w:id="327"/>
       <w:r>
         <w:rPr>
@@ -35763,7 +35951,7 @@
         <w:spacing w:before="200" w:after="80"/>
         <w:rPr/>
       </w:pPr>
-      <w:bookmarkStart w:id="330" w:name="__RefHeading___Toc8773_131033504"/>
+      <w:bookmarkStart w:id="330" w:name="__RefHeading___Toc8857_1988885074"/>
       <w:bookmarkEnd w:id="330"/>
       <w:r>
         <w:rPr>
@@ -37800,7 +37988,7 @@
         <w:spacing w:before="280" w:after="80"/>
         <w:rPr/>
       </w:pPr>
-      <w:bookmarkStart w:id="333" w:name="__RefHeading___Toc8775_131033504"/>
+      <w:bookmarkStart w:id="333" w:name="__RefHeading___Toc8859_1988885074"/>
       <w:bookmarkStart w:id="334" w:name="architecture-comparison-rapids-vs-stream"/>
       <w:bookmarkEnd w:id="333"/>
       <w:r>
@@ -38838,7 +39026,7 @@
         <w:spacing w:before="280" w:after="80"/>
         <w:rPr/>
       </w:pPr>
-      <w:bookmarkStart w:id="337" w:name="__RefHeading___Toc8777_131033504"/>
+      <w:bookmarkStart w:id="337" w:name="__RefHeading___Toc8861_1988885074"/>
       <w:bookmarkStart w:id="338" w:name="clock-and-reset-summary"/>
       <w:bookmarkEnd w:id="337"/>
       <w:r>
@@ -38866,7 +39054,7 @@
         <w:spacing w:before="200" w:after="80"/>
         <w:rPr/>
       </w:pPr>
-      <w:bookmarkStart w:id="339" w:name="__RefHeading___Toc8779_131033504"/>
+      <w:bookmarkStart w:id="339" w:name="__RefHeading___Toc8863_1988885074"/>
       <w:bookmarkEnd w:id="339"/>
       <w:r>
         <w:rPr>
@@ -39137,7 +39325,7 @@
         <w:spacing w:before="200" w:after="80"/>
         <w:rPr/>
       </w:pPr>
-      <w:bookmarkStart w:id="342" w:name="__RefHeading___Toc8781_131033504"/>
+      <w:bookmarkStart w:id="342" w:name="__RefHeading___Toc8865_1988885074"/>
       <w:bookmarkEnd w:id="342"/>
       <w:r>
         <w:rPr>
@@ -39574,7 +39762,7 @@
         <w:spacing w:before="280" w:after="80"/>
         <w:rPr/>
       </w:pPr>
-      <w:bookmarkStart w:id="345" w:name="__RefHeading___Toc8783_131033504"/>
+      <w:bookmarkStart w:id="345" w:name="__RefHeading___Toc8867_1988885074"/>
       <w:bookmarkStart w:id="346" w:name="interface-summary"/>
       <w:bookmarkEnd w:id="345"/>
       <w:r>
@@ -39602,7 +39790,7 @@
         <w:spacing w:before="200" w:after="80"/>
         <w:rPr/>
       </w:pPr>
-      <w:bookmarkStart w:id="347" w:name="__RefHeading___Toc8785_131033504"/>
+      <w:bookmarkStart w:id="347" w:name="__RefHeading___Toc8869_1988885074"/>
       <w:bookmarkEnd w:id="347"/>
       <w:r>
         <w:rPr>
@@ -40576,7 +40764,7 @@
         <w:spacing w:before="200" w:after="80"/>
         <w:rPr/>
       </w:pPr>
-      <w:bookmarkStart w:id="350" w:name="__RefHeading___Toc8787_131033504"/>
+      <w:bookmarkStart w:id="350" w:name="__RefHeading___Toc8871_1988885074"/>
       <w:bookmarkEnd w:id="350"/>
       <w:r>
         <w:rPr>
@@ -41103,7 +41291,7 @@
         <w:spacing w:before="280" w:after="80"/>
         <w:rPr/>
       </w:pPr>
-      <w:bookmarkStart w:id="353" w:name="__RefHeading___Toc8789_131033504"/>
+      <w:bookmarkStart w:id="353" w:name="__RefHeading___Toc8873_1988885074"/>
       <w:bookmarkStart w:id="354" w:name="related-documentation-1"/>
       <w:bookmarkEnd w:id="353"/>
       <w:r>
@@ -41269,7 +41457,7 @@
         <w:spacing w:before="280" w:after="80"/>
         <w:rPr/>
       </w:pPr>
-      <w:bookmarkStart w:id="356" w:name="__RefHeading___Toc8791_131033504"/>
+      <w:bookmarkStart w:id="356" w:name="__RefHeading___Toc8875_1988885074"/>
       <w:bookmarkStart w:id="357" w:name="specification-conventions"/>
       <w:bookmarkEnd w:id="356"/>
       <w:r>
@@ -41297,7 +41485,7 @@
         <w:spacing w:before="200" w:after="80"/>
         <w:rPr/>
       </w:pPr>
-      <w:bookmarkStart w:id="358" w:name="__RefHeading___Toc8793_131033504"/>
+      <w:bookmarkStart w:id="358" w:name="__RefHeading___Toc8877_1988885074"/>
       <w:bookmarkStart w:id="359" w:name="signal-naming"/>
       <w:bookmarkEnd w:id="358"/>
       <w:r>
@@ -41507,7 +41695,7 @@
         <w:spacing w:before="200" w:after="80"/>
         <w:rPr/>
       </w:pPr>
-      <w:bookmarkStart w:id="360" w:name="__RefHeading___Toc8795_131033504"/>
+      <w:bookmarkStart w:id="360" w:name="__RefHeading___Toc8879_1988885074"/>
       <w:bookmarkStart w:id="361" w:name="parameter-naming"/>
       <w:bookmarkEnd w:id="360"/>
       <w:r>
@@ -41610,7 +41798,7 @@
         <w:spacing w:before="200" w:after="80"/>
         <w:rPr/>
       </w:pPr>
-      <w:bookmarkStart w:id="362" w:name="__RefHeading___Toc8797_131033504"/>
+      <w:bookmarkStart w:id="362" w:name="__RefHeading___Toc8881_1988885074"/>
       <w:bookmarkStart w:id="363" w:name="figure-and-table-numbering"/>
       <w:bookmarkEnd w:id="362"/>
       <w:r>
@@ -41890,7 +42078,7 @@
         <w:spacing w:before="360" w:after="120"/>
         <w:rPr/>
       </w:pPr>
-      <w:bookmarkStart w:id="367" w:name="__RefHeading___Toc8799_131033504"/>
+      <w:bookmarkStart w:id="367" w:name="__RefHeading___Toc8883_1988885074"/>
       <w:bookmarkStart w:id="368" w:name="X3da2ebef901f3a8a14bd4b53d1e99ce8b71e459"/>
       <w:bookmarkEnd w:id="367"/>
       <w:r>
@@ -42044,7 +42232,7 @@
         <w:spacing w:before="280" w:after="80"/>
         <w:rPr/>
       </w:pPr>
-      <w:bookmarkStart w:id="369" w:name="__RefHeading___Toc8801_131033504"/>
+      <w:bookmarkStart w:id="369" w:name="__RefHeading___Toc8885_1988885074"/>
       <w:bookmarkStart w:id="370" w:name="overview"/>
       <w:bookmarkEnd w:id="369"/>
       <w:r>
@@ -42110,7 +42298,7 @@
         <w:spacing w:before="200" w:after="80"/>
         <w:rPr/>
       </w:pPr>
-      <w:bookmarkStart w:id="371" w:name="__RefHeading___Toc8803_131033504"/>
+      <w:bookmarkStart w:id="371" w:name="__RefHeading___Toc8887_1988885074"/>
       <w:bookmarkStart w:id="372" w:name="key-features-1"/>
       <w:bookmarkEnd w:id="371"/>
       <w:r>
@@ -42366,7 +42554,7 @@
         <w:spacing w:before="200" w:after="80"/>
         <w:rPr/>
       </w:pPr>
-      <w:bookmarkStart w:id="373" w:name="__RefHeading___Toc8805_131033504"/>
+      <w:bookmarkStart w:id="373" w:name="__RefHeading___Toc8889_1988885074"/>
       <w:bookmarkStart w:id="374" w:name="companion-specifications"/>
       <w:bookmarkEnd w:id="373"/>
       <w:r>
@@ -42534,7 +42722,7 @@
         <w:spacing w:before="280" w:after="80"/>
         <w:rPr/>
       </w:pPr>
-      <w:bookmarkStart w:id="377" w:name="__RefHeading___Toc8807_131033504"/>
+      <w:bookmarkStart w:id="377" w:name="__RefHeading___Toc8891_1988885074"/>
       <w:bookmarkStart w:id="378" w:name="navigation-1"/>
       <w:bookmarkEnd w:id="377"/>
       <w:r>
@@ -42562,7 +42750,7 @@
         <w:spacing w:before="200" w:after="80"/>
         <w:rPr/>
       </w:pPr>
-      <w:bookmarkStart w:id="379" w:name="__RefHeading___Toc8809_131033504"/>
+      <w:bookmarkStart w:id="379" w:name="__RefHeading___Toc8893_1988885074"/>
       <w:bookmarkStart w:id="380" w:name="front-matter-2"/>
       <w:bookmarkEnd w:id="379"/>
       <w:r>
@@ -42610,7 +42798,7 @@
         <w:spacing w:before="200" w:after="80"/>
         <w:rPr/>
       </w:pPr>
-      <w:bookmarkStart w:id="382" w:name="__RefHeading___Toc8811_131033504"/>
+      <w:bookmarkStart w:id="382" w:name="__RefHeading___Toc8895_1988885074"/>
       <w:bookmarkStart w:id="383" w:name="chapter-1-introduction-1"/>
       <w:bookmarkEnd w:id="382"/>
       <w:r>
@@ -42658,7 +42846,7 @@
         <w:spacing w:before="200" w:after="80"/>
         <w:rPr/>
       </w:pPr>
-      <w:bookmarkStart w:id="385" w:name="__RefHeading___Toc8813_131033504"/>
+      <w:bookmarkStart w:id="385" w:name="__RefHeading___Toc8897_1988885074"/>
       <w:bookmarkStart w:id="386" w:name="chapter-2-block-descriptions"/>
       <w:bookmarkEnd w:id="385"/>
       <w:r>
@@ -42832,7 +43020,7 @@
         <w:spacing w:before="200" w:after="80"/>
         <w:rPr/>
       </w:pPr>
-      <w:bookmarkStart w:id="388" w:name="__RefHeading___Toc8815_131033504"/>
+      <w:bookmarkStart w:id="388" w:name="__RefHeading___Toc8899_1988885074"/>
       <w:bookmarkStart w:id="389" w:name="chapter-3-cycle-level-behavior"/>
       <w:bookmarkEnd w:id="388"/>
       <w:r>
@@ -42898,7 +43086,7 @@
         <w:spacing w:before="200" w:after="80"/>
         <w:rPr/>
       </w:pPr>
-      <w:bookmarkStart w:id="391" w:name="__RefHeading___Toc8817_131033504"/>
+      <w:bookmarkStart w:id="391" w:name="__RefHeading___Toc8901_1988885074"/>
       <w:bookmarkStart w:id="392" w:name="chapter-4-generated-rtl"/>
       <w:bookmarkEnd w:id="391"/>
       <w:r>
@@ -42964,7 +43152,7 @@
         <w:spacing w:before="200" w:after="80"/>
         <w:rPr/>
       </w:pPr>
-      <w:bookmarkStart w:id="394" w:name="__RefHeading___Toc8819_131033504"/>
+      <w:bookmarkStart w:id="394" w:name="__RefHeading___Toc8903_1988885074"/>
       <w:bookmarkStart w:id="395" w:name="chapter-5-verification"/>
       <w:bookmarkEnd w:id="394"/>
       <w:r>
@@ -43200,7 +43388,7 @@
         <w:spacing w:before="360" w:after="120"/>
         <w:rPr/>
       </w:pPr>
-      <w:bookmarkStart w:id="399" w:name="__RefHeading___Toc8821_131033504"/>
+      <w:bookmarkStart w:id="399" w:name="__RefHeading___Toc8905_1988885074"/>
       <w:bookmarkStart w:id="400" w:name="risc-v-falcon-suite"/>
       <w:bookmarkEnd w:id="399"/>
       <w:r>
@@ -43314,7 +43502,7 @@
         <w:spacing w:before="280" w:after="80"/>
         <w:rPr/>
       </w:pPr>
-      <w:bookmarkStart w:id="401" w:name="__RefHeading___Toc8823_131033504"/>
+      <w:bookmarkStart w:id="401" w:name="__RefHeading___Toc8907_1988885074"/>
       <w:bookmarkStart w:id="402" w:name="the-ladder"/>
       <w:bookmarkEnd w:id="401"/>
       <w:r>
@@ -44441,7 +44629,7 @@
         <w:spacing w:before="200" w:after="80"/>
         <w:rPr/>
       </w:pPr>
-      <w:bookmarkStart w:id="403" w:name="__RefHeading___Toc8825_131033504"/>
+      <w:bookmarkStart w:id="403" w:name="__RefHeading___Toc8909_1988885074"/>
       <w:bookmarkEnd w:id="403"/>
       <w:r>
         <w:rPr>
@@ -44548,7 +44736,7 @@
         <w:spacing w:before="280" w:after="80"/>
         <w:rPr/>
       </w:pPr>
-      <w:bookmarkStart w:id="404" w:name="__RefHeading___Toc8827_131033504"/>
+      <w:bookmarkStart w:id="404" w:name="__RefHeading___Toc8911_1988885074"/>
       <w:bookmarkStart w:id="405" w:name="goals-per-rung"/>
       <w:bookmarkEnd w:id="404"/>
       <w:r>
@@ -44830,7 +45018,7 @@
         <w:spacing w:before="280" w:after="80"/>
         <w:rPr/>
       </w:pPr>
-      <w:bookmarkStart w:id="406" w:name="__RefHeading___Toc8829_131033504"/>
+      <w:bookmarkStart w:id="406" w:name="__RefHeading___Toc8913_1988885074"/>
       <w:bookmarkStart w:id="407" w:name="packaging-per-rung-the-mc-line-treatment"/>
       <w:bookmarkEnd w:id="406"/>
       <w:r>
@@ -45022,7 +45210,7 @@
         <w:spacing w:before="280" w:after="80"/>
         <w:rPr/>
       </w:pPr>
-      <w:bookmarkStart w:id="408" w:name="__RefHeading___Toc8831_131033504"/>
+      <w:bookmarkStart w:id="408" w:name="__RefHeading___Toc8915_1988885074"/>
       <w:bookmarkStart w:id="409" w:name="references-and-layout"/>
       <w:bookmarkEnd w:id="408"/>
       <w:r>

</xml_diff>